<commit_message>
FN5: audit fixes (Combine covers a root product and a fraction quotient, swap-flag order, Compose 4 and Evaluate 3 replaced, CheckIt letters, Quick Summary, speak lines); doc tool parenthesizes denominators and labels diagrams; audit md, README row
Co-Authored-By: Claude Opus 5.5 <noreply@anthropic.com>
Claude-Session: https://claude.ai/code/session_013Y8PfETWcMLvmUEpCdE8Wq
</commit_message>
<xml_diff>
--- a/support-materials/FN5/FN5_worked_examples.docx
+++ b/support-materials/FN5/FN5_worked_examples.docx
@@ -111,7 +111,7 @@
           <wp:inline distT="0" distB="0" distL="0" distR="0">
             <wp:extent cx="4762500" cy="1657350"/>
             <wp:effectExtent t="0" r="0" b="0" l="0"/>
-            <wp:docPr id="1" name="cb1" descr="One input feeding two machines whose outputs are added. Plotted data: A diagram. The same input, x, goes into two machines, f and g. Their outputs, f(x) and g(x), meet at a plus sign, giving f(x) + g(x)." title="One input feeding two machines whose outputs are added"/>
+            <wp:docPr id="1" name="cb1" descr="One input feeding two machines whose outputs are added. Diagram: A diagram. The same input, x, goes into two machines, f and g. Their outputs, f(x) and g(x), meet at a plus sign, giving f(x) + g(x)." title="One input feeding two machines whose outputs are added"/>
             <wp:cNvGraphicFramePr>
               <a:graphicFrameLocks xmlns:a="http://schemas.openxmlformats.org/drawingml/2006/main" noChangeAspect="1"/>
             </wp:cNvGraphicFramePr>
@@ -158,7 +158,7 @@
           <w:sz w:val="22"/>
           <w:szCs w:val="22"/>
         </w:rPr>
-        <w:t xml:space="preserve">Plotted data: </w:t>
+        <w:t xml:space="preserve">Diagram: </w:t>
       </w:r>
       <w:r>
         <w:rPr>
@@ -1015,7 +1015,7 @@
           <w:sz w:val="40"/>
           <w:szCs w:val="40"/>
         </w:rPr>
-        <w:t xml:space="preserve">f(x)=3x−4</w:t>
+        <w:t xml:space="preserve">p(x)=4x−1</w:t>
       </w:r>
     </w:p>
     <w:p>
@@ -1030,18 +1030,248 @@
           <w:sz w:val="40"/>
           <w:szCs w:val="40"/>
         </w:rPr>
-        <w:t xml:space="preserve">g(x)=2x</w:t>
-      </w:r>
+        <w:t xml:space="preserve">r(x)=√(3x+2)</w:t>
+      </w:r>
+    </w:p>
+    <w:p>
+      <w:pPr>
+        <w:pStyle w:val="Heading3"/>
+        <w:keepNext/>
+      </w:pPr>
+      <w:r>
+        <w:t xml:space="preserve">Question</w:t>
+      </w:r>
+    </w:p>
+    <w:p>
+      <w:pPr>
+        <w:spacing w:after="120" w:before="80" w:line="300"/>
+      </w:pPr>
+      <w:r>
+        <w:t xml:space="preserve">Find p(x) · r(x).</w:t>
+      </w:r>
+    </w:p>
+    <w:p>
+      <w:pPr>
+        <w:spacing w:after="40" w:before="20"/>
+        <w:ind w:left="360"/>
+      </w:pPr>
+      <w:r>
+        <w:rPr>
+          <w:b/>
+          <w:bCs/>
+        </w:rPr>
+        <w:t xml:space="preserve">A.  </w:t>
+      </w:r>
+      <w:r>
+        <w:rPr>
+          <w:i/>
+          <w:iCs/>
+        </w:rPr>
+        <w:t xml:space="preserve">4x√(3x+2)−1</w:t>
+      </w:r>
+    </w:p>
+    <w:p>
+      <w:pPr>
+        <w:spacing w:after="40" w:before="20"/>
+        <w:ind w:left="360"/>
+      </w:pPr>
+      <w:r>
+        <w:rPr>
+          <w:b/>
+          <w:bCs/>
+        </w:rPr>
+        <w:t xml:space="preserve">B.  </w:t>
+      </w:r>
+      <w:r>
+        <w:rPr>
+          <w:i/>
+          <w:iCs/>
+        </w:rPr>
+        <w:t xml:space="preserve">(4x−1)√(3x+2)</w:t>
+      </w:r>
+    </w:p>
+    <w:p>
+      <w:pPr>
+        <w:spacing w:after="40" w:before="20"/>
+        <w:ind w:left="360"/>
+      </w:pPr>
+      <w:r>
+        <w:rPr>
+          <w:b/>
+          <w:bCs/>
+        </w:rPr>
+        <w:t xml:space="preserve">C.  </w:t>
+      </w:r>
+      <w:r>
+        <w:rPr>
+          <w:i/>
+          <w:iCs/>
+        </w:rPr>
+        <w:t xml:space="preserve">√(12x−1)</w:t>
+      </w:r>
+    </w:p>
+    <w:p>
+      <w:pPr>
+        <w:spacing w:after="40" w:before="20"/>
+        <w:ind w:left="360"/>
+      </w:pPr>
+      <w:r>
+        <w:rPr>
+          <w:b/>
+          <w:bCs/>
+        </w:rPr>
+        <w:t xml:space="preserve">D.  </w:t>
+      </w:r>
+      <w:r>
+        <w:rPr>
+          <w:i/>
+          <w:iCs/>
+        </w:rPr>
+        <w:t xml:space="preserve">√((4x−1)(3x+2))</w:t>
+      </w:r>
+    </w:p>
+    <w:p>
+      <w:pPr>
+        <w:pStyle w:val="Heading3"/>
+        <w:keepNext/>
+      </w:pPr>
+      <w:r>
+        <w:t xml:space="preserve">Answer and reasoning</w:t>
+      </w:r>
+    </w:p>
+    <w:p>
+      <w:pPr>
+        <w:spacing w:after="120" w:before="80" w:line="300"/>
+      </w:pPr>
+      <w:r>
+        <w:t xml:space="preserve">Multiply the two outputs, keeping </w:t>
+      </w:r>
+      <w:r>
+        <w:rPr>
+          <w:i/>
+          <w:iCs/>
+        </w:rPr>
+        <w:t xml:space="preserve">4x−1</w:t>
+      </w:r>
+      <w:r>
+        <w:t xml:space="preserve"> in parentheses so the whole thing multiplies the root: </w:t>
+      </w:r>
+      <w:r>
+        <w:rPr>
+          <w:i/>
+          <w:iCs/>
+        </w:rPr>
+        <w:t xml:space="preserve">(4x−1)√(3x+2)</w:t>
+      </w:r>
+      <w:r>
+        <w:t xml:space="preserve">. That is as far as it goes, and it is how CheckIt writes a product. </w:t>
+      </w:r>
+      <w:r>
+        <w:rPr>
+          <w:i/>
+          <w:iCs/>
+        </w:rPr>
+        <w:t xml:space="preserve">4x√(3x+2)−1</w:t>
+      </w:r>
+      <w:r>
+        <w:t xml:space="preserve"> leaves the parentheses off, so only </w:t>
+      </w:r>
+      <w:r>
+        <w:rPr>
+          <w:i/>
+          <w:iCs/>
+        </w:rPr>
+        <w:t xml:space="preserve">4x</w:t>
+      </w:r>
+      <w:r>
+        <w:t xml:space="preserve"> multiplies; </w:t>
+      </w:r>
+      <w:r>
+        <w:rPr>
+          <w:i/>
+          <w:iCs/>
+        </w:rPr>
+        <w:t xml:space="preserve">√(12x−1)</w:t>
+      </w:r>
+      <w:r>
+        <w:t xml:space="preserve"> is </w:t>
+      </w:r>
+      <w:r>
+        <w:rPr>
+          <w:i/>
+          <w:iCs/>
+        </w:rPr>
+        <w:t xml:space="preserve">r(p(x))=√(3(4x−1)+2)</w:t>
+      </w:r>
+      <w:r>
+        <w:t xml:space="preserve">, a composition; and </w:t>
+      </w:r>
+      <w:r>
+        <w:rPr>
+          <w:i/>
+          <w:iCs/>
+        </w:rPr>
+        <w:t xml:space="preserve">√((4x−1)(3x+2))</w:t>
+      </w:r>
+      <w:r>
+        <w:t xml:space="preserve"> moves </w:t>
+      </w:r>
+      <w:r>
+        <w:rPr>
+          <w:i/>
+          <w:iCs/>
+        </w:rPr>
+        <w:t xml:space="preserve">4x−1</w:t>
+      </w:r>
+      <w:r>
+        <w:t xml:space="preserve"> under the root, where it would be square-rooted too. </w:t>
+      </w:r>
+      <w:r>
+        <w:rPr>
+          <w:b/>
+          <w:bCs/>
+          <w:i/>
+          <w:iCs/>
+        </w:rPr>
+        <w:t xml:space="preserve">(4x−1)√(3x+2)</w:t>
+      </w:r>
+      <w:r>
+        <w:rPr>
+          <w:b/>
+          <w:bCs/>
+        </w:rPr>
+        <w:t xml:space="preserve">.</w:t>
+      </w:r>
+    </w:p>
+    <w:p>
+      <w:pPr>
+        <w:pStyle w:val="Heading2"/>
+        <w:pageBreakBefore/>
+      </w:pPr>
+      <w:r>
+        <w:t xml:space="preserve">Example 4: Quotient</w:t>
+      </w:r>
+    </w:p>
+    <w:p>
+      <w:pPr>
+        <w:spacing w:after="40" w:before="200"/>
+        <w:jc w:val="center"/>
+      </w:pPr>
       <w:r>
         <w:rPr>
           <w:i/>
           <w:iCs/>
           <w:sz w:val="40"/>
           <w:szCs w:val="40"/>
-          <w:vertAlign w:val="superscript"/>
-        </w:rPr>
-        <w:t xml:space="preserve">2</w:t>
-      </w:r>
+        </w:rPr>
+        <w:t xml:space="preserve">g(x)=3x+1</w:t>
+      </w:r>
+    </w:p>
+    <w:p>
+      <w:pPr>
+        <w:spacing w:after="200" w:before="40"/>
+        <w:jc w:val="center"/>
+      </w:pPr>
       <w:r>
         <w:rPr>
           <w:i/>
@@ -1049,7 +1279,7 @@
           <w:sz w:val="40"/>
           <w:szCs w:val="40"/>
         </w:rPr>
-        <w:t xml:space="preserve">+5</w:t>
+        <w:t xml:space="preserve">h(x)=2x/(x−4)</w:t>
       </w:r>
     </w:p>
     <w:p>
@@ -1066,7 +1296,7 @@
         <w:spacing w:after="120" w:before="80" w:line="300"/>
       </w:pPr>
       <w:r>
-        <w:t xml:space="preserve">Find f(x) · g(x), multiplied out.</w:t>
+        <w:t xml:space="preserve">Find g(x) divided by h(x).</w:t>
       </w:r>
     </w:p>
     <w:p>
@@ -1086,22 +1316,7 @@
           <w:i/>
           <w:iCs/>
         </w:rPr>
-        <w:t xml:space="preserve">6x</w:t>
-      </w:r>
-      <w:r>
-        <w:rPr>
-          <w:i/>
-          <w:iCs/>
-          <w:vertAlign w:val="superscript"/>
-        </w:rPr>
-        <w:t xml:space="preserve">3</w:t>
-      </w:r>
-      <w:r>
-        <w:rPr>
-          <w:i/>
-          <w:iCs/>
-        </w:rPr>
-        <w:t xml:space="preserve">−20</w:t>
+        <w:t xml:space="preserve">((3x+1)(x−4))/(2x)</w:t>
       </w:r>
     </w:p>
     <w:p>
@@ -1121,37 +1336,7 @@
           <w:i/>
           <w:iCs/>
         </w:rPr>
-        <w:t xml:space="preserve">6x</w:t>
-      </w:r>
-      <w:r>
-        <w:rPr>
-          <w:i/>
-          <w:iCs/>
-          <w:vertAlign w:val="superscript"/>
-        </w:rPr>
-        <w:t xml:space="preserve">3</w:t>
-      </w:r>
-      <w:r>
-        <w:rPr>
-          <w:i/>
-          <w:iCs/>
-        </w:rPr>
-        <w:t xml:space="preserve">−8x</w:t>
-      </w:r>
-      <w:r>
-        <w:rPr>
-          <w:i/>
-          <w:iCs/>
-          <w:vertAlign w:val="superscript"/>
-        </w:rPr>
-        <w:t xml:space="preserve">2</w:t>
-      </w:r>
-      <w:r>
-        <w:rPr>
-          <w:i/>
-          <w:iCs/>
-        </w:rPr>
-        <w:t xml:space="preserve">+15x−20</w:t>
+        <w:t xml:space="preserve">2x/((3x+1)(x−4))</w:t>
       </w:r>
     </w:p>
     <w:p>
@@ -1171,37 +1356,7 @@
           <w:i/>
           <w:iCs/>
         </w:rPr>
-        <w:t xml:space="preserve">6x</w:t>
-      </w:r>
-      <w:r>
-        <w:rPr>
-          <w:i/>
-          <w:iCs/>
-          <w:vertAlign w:val="superscript"/>
-        </w:rPr>
-        <w:t xml:space="preserve">3</w:t>
-      </w:r>
-      <w:r>
-        <w:rPr>
-          <w:i/>
-          <w:iCs/>
-        </w:rPr>
-        <w:t xml:space="preserve">+8x</w:t>
-      </w:r>
-      <w:r>
-        <w:rPr>
-          <w:i/>
-          <w:iCs/>
-          <w:vertAlign w:val="superscript"/>
-        </w:rPr>
-        <w:t xml:space="preserve">2</w:t>
-      </w:r>
-      <w:r>
-        <w:rPr>
-          <w:i/>
-          <w:iCs/>
-        </w:rPr>
-        <w:t xml:space="preserve">+15x−20</w:t>
+        <w:t xml:space="preserve">(2x(3x+1))/(x−4)</w:t>
       </w:r>
     </w:p>
     <w:p>
@@ -1221,37 +1376,7 @@
           <w:i/>
           <w:iCs/>
         </w:rPr>
-        <w:t xml:space="preserve">5x</w:t>
-      </w:r>
-      <w:r>
-        <w:rPr>
-          <w:i/>
-          <w:iCs/>
-          <w:vertAlign w:val="superscript"/>
-        </w:rPr>
-        <w:t xml:space="preserve">3</w:t>
-      </w:r>
-      <w:r>
-        <w:rPr>
-          <w:i/>
-          <w:iCs/>
-        </w:rPr>
-        <w:t xml:space="preserve">−8x</w:t>
-      </w:r>
-      <w:r>
-        <w:rPr>
-          <w:i/>
-          <w:iCs/>
-          <w:vertAlign w:val="superscript"/>
-        </w:rPr>
-        <w:t xml:space="preserve">2</w:t>
-      </w:r>
-      <w:r>
-        <w:rPr>
-          <w:i/>
-          <w:iCs/>
-        </w:rPr>
-        <w:t xml:space="preserve">+15x−20</w:t>
+        <w:t xml:space="preserve">(3x+1)/(2x)</w:t>
       </w:r>
     </w:p>
     <w:p>
@@ -1268,165 +1393,14 @@
         <w:spacing w:after="120" w:before="80" w:line="300"/>
       </w:pPr>
       <w:r>
-        <w:t xml:space="preserve">Multiply each term of </w:t>
-      </w:r>
-      <w:r>
-        <w:rPr>
-          <w:i/>
-          <w:iCs/>
-        </w:rPr>
-        <w:t xml:space="preserve">3x−4</w:t>
-      </w:r>
-      <w:r>
-        <w:t xml:space="preserve"> by each term of </w:t>
-      </w:r>
-      <w:r>
-        <w:rPr>
-          <w:i/>
-          <w:iCs/>
-        </w:rPr>
-        <w:t xml:space="preserve">2x</w:t>
-      </w:r>
-      <w:r>
-        <w:rPr>
-          <w:i/>
-          <w:iCs/>
-          <w:vertAlign w:val="superscript"/>
-        </w:rPr>
-        <w:t xml:space="preserve">2</w:t>
-      </w:r>
-      <w:r>
-        <w:rPr>
-          <w:i/>
-          <w:iCs/>
-        </w:rPr>
-        <w:t xml:space="preserve">+5</w:t>
-      </w:r>
-      <w:r>
-        <w:t xml:space="preserve">: </w:t>
-      </w:r>
-      <w:r>
-        <w:rPr>
-          <w:i/>
-          <w:iCs/>
-        </w:rPr>
-        <w:t xml:space="preserve">3x· 2x</w:t>
-      </w:r>
-      <w:r>
-        <w:rPr>
-          <w:i/>
-          <w:iCs/>
-          <w:vertAlign w:val="superscript"/>
-        </w:rPr>
-        <w:t xml:space="preserve">2</w:t>
-      </w:r>
-      <w:r>
-        <w:rPr>
-          <w:i/>
-          <w:iCs/>
-        </w:rPr>
-        <w:t xml:space="preserve">=6x</w:t>
-      </w:r>
-      <w:r>
-        <w:rPr>
-          <w:i/>
-          <w:iCs/>
-          <w:vertAlign w:val="superscript"/>
-        </w:rPr>
-        <w:t xml:space="preserve">3</w:t>
-      </w:r>
-      <w:r>
-        <w:t xml:space="preserve">, </w:t>
-      </w:r>
-      <w:r>
-        <w:rPr>
-          <w:i/>
-          <w:iCs/>
-        </w:rPr>
-        <w:t xml:space="preserve">3x· 5=15x</w:t>
-      </w:r>
-      <w:r>
-        <w:t xml:space="preserve">, </w:t>
-      </w:r>
-      <w:r>
-        <w:rPr>
-          <w:i/>
-          <w:iCs/>
-        </w:rPr>
-        <w:t xml:space="preserve">−4· 2x</w:t>
-      </w:r>
-      <w:r>
-        <w:rPr>
-          <w:i/>
-          <w:iCs/>
-          <w:vertAlign w:val="superscript"/>
-        </w:rPr>
-        <w:t xml:space="preserve">2</w:t>
-      </w:r>
-      <w:r>
-        <w:rPr>
-          <w:i/>
-          <w:iCs/>
-        </w:rPr>
-        <w:t xml:space="preserve">=−8x</w:t>
-      </w:r>
-      <w:r>
-        <w:rPr>
-          <w:i/>
-          <w:iCs/>
-          <w:vertAlign w:val="superscript"/>
-        </w:rPr>
-        <w:t xml:space="preserve">2</w:t>
-      </w:r>
-      <w:r>
-        <w:t xml:space="preserve">, and </w:t>
-      </w:r>
-      <w:r>
-        <w:rPr>
-          <w:i/>
-          <w:iCs/>
-        </w:rPr>
-        <w:t xml:space="preserve">−4· 5=−20</w:t>
-      </w:r>
-      <w:r>
-        <w:t xml:space="preserve">. Together: </w:t>
-      </w:r>
-      <w:r>
-        <w:rPr>
-          <w:i/>
-          <w:iCs/>
-        </w:rPr>
-        <w:t xml:space="preserve">6x</w:t>
-      </w:r>
-      <w:r>
-        <w:rPr>
-          <w:i/>
-          <w:iCs/>
-          <w:vertAlign w:val="superscript"/>
-        </w:rPr>
-        <w:t xml:space="preserve">3</w:t>
-      </w:r>
-      <w:r>
-        <w:rPr>
-          <w:i/>
-          <w:iCs/>
-        </w:rPr>
-        <w:t xml:space="preserve">−8x</w:t>
-      </w:r>
-      <w:r>
-        <w:rPr>
-          <w:i/>
-          <w:iCs/>
-          <w:vertAlign w:val="superscript"/>
-        </w:rPr>
-        <w:t xml:space="preserve">2</w:t>
-      </w:r>
-      <w:r>
-        <w:rPr>
-          <w:i/>
-          <w:iCs/>
-        </w:rPr>
-        <w:t xml:space="preserve">+15x−20</w:t>
+        <w:t xml:space="preserve">Dividing by a fraction means multiplying by its flip: </w:t>
+      </w:r>
+      <w:r>
+        <w:rPr>
+          <w:i/>
+          <w:iCs/>
+        </w:rPr>
+        <w:t xml:space="preserve">(3x+1)÷(2x/(x−4))=(3x+1)·(x−4)/(2x)=((3x+1)(x−4))/(2x)</w:t>
       </w:r>
       <w:r>
         <w:t xml:space="preserve">. </w:t>
@@ -1436,133 +1410,79 @@
           <w:i/>
           <w:iCs/>
         </w:rPr>
-        <w:t xml:space="preserve">6x</w:t>
-      </w:r>
-      <w:r>
-        <w:rPr>
-          <w:i/>
-          <w:iCs/>
-          <w:vertAlign w:val="superscript"/>
-        </w:rPr>
-        <w:t xml:space="preserve">3</w:t>
-      </w:r>
-      <w:r>
-        <w:rPr>
-          <w:i/>
-          <w:iCs/>
-        </w:rPr>
-        <w:t xml:space="preserve">−20</w:t>
-      </w:r>
-      <w:r>
-        <w:t xml:space="preserve"> keeps only the first and last products; </w:t>
-      </w:r>
-      <w:r>
-        <w:rPr>
-          <w:i/>
-          <w:iCs/>
-        </w:rPr>
-        <w:t xml:space="preserve">+8x</w:t>
-      </w:r>
-      <w:r>
-        <w:rPr>
-          <w:i/>
-          <w:iCs/>
-          <w:vertAlign w:val="superscript"/>
-        </w:rPr>
-        <w:t xml:space="preserve">2</w:t>
-      </w:r>
-      <w:r>
-        <w:t xml:space="preserve"> loses the minus on the 4; and </w:t>
-      </w:r>
-      <w:r>
-        <w:rPr>
-          <w:i/>
-          <w:iCs/>
-        </w:rPr>
-        <w:t xml:space="preserve">5x</w:t>
-      </w:r>
-      <w:r>
-        <w:rPr>
-          <w:i/>
-          <w:iCs/>
-          <w:vertAlign w:val="superscript"/>
-        </w:rPr>
-        <w:t xml:space="preserve">3</w:t>
-      </w:r>
-      <w:r>
-        <w:t xml:space="preserve"> adds 3 and 2 instead of multiplying them. CheckIt may show the product unexpanded, as </w:t>
-      </w:r>
-      <w:r>
-        <w:rPr>
-          <w:i/>
-          <w:iCs/>
-        </w:rPr>
-        <w:t xml:space="preserve">(3x−4)(2x</w:t>
-      </w:r>
-      <w:r>
-        <w:rPr>
-          <w:i/>
-          <w:iCs/>
-          <w:vertAlign w:val="superscript"/>
-        </w:rPr>
-        <w:t xml:space="preserve">2</w:t>
-      </w:r>
-      <w:r>
-        <w:rPr>
-          <w:i/>
-          <w:iCs/>
-        </w:rPr>
-        <w:t xml:space="preserve">+5)</w:t>
-      </w:r>
-      <w:r>
-        <w:t xml:space="preserve">; that is the same function. </w:t>
-      </w:r>
-      <w:r>
-        <w:rPr>
-          <w:b/>
-          <w:bCs/>
-          <w:i/>
-          <w:iCs/>
-        </w:rPr>
-        <w:t xml:space="preserve">6x</w:t>
-      </w:r>
-      <w:r>
-        <w:rPr>
-          <w:b/>
-          <w:bCs/>
-          <w:i/>
-          <w:iCs/>
-          <w:vertAlign w:val="superscript"/>
-        </w:rPr>
-        <w:t xml:space="preserve">3</w:t>
-      </w:r>
-      <w:r>
-        <w:rPr>
-          <w:b/>
-          <w:bCs/>
-          <w:i/>
-          <w:iCs/>
-        </w:rPr>
-        <w:t xml:space="preserve">−8x</w:t>
-      </w:r>
-      <w:r>
-        <w:rPr>
-          <w:b/>
-          <w:bCs/>
-          <w:i/>
-          <w:iCs/>
-          <w:vertAlign w:val="superscript"/>
-        </w:rPr>
-        <w:t xml:space="preserve">2</w:t>
-      </w:r>
-      <w:r>
-        <w:rPr>
-          <w:b/>
-          <w:bCs/>
-          <w:i/>
-          <w:iCs/>
-        </w:rPr>
-        <w:t xml:space="preserve">+15x−20</w:t>
+        <w:t xml:space="preserve">2x/((3x+1)(x−4))</w:t>
+      </w:r>
+      <w:r>
+        <w:t xml:space="preserve"> is the flip of the answer, </w:t>
+      </w:r>
+      <w:r>
+        <w:rPr>
+          <w:i/>
+          <w:iCs/>
+        </w:rPr>
+        <w:t xml:space="preserve">h(x)</w:t>
+      </w:r>
+      <w:r>
+        <w:t xml:space="preserve"> divided by </w:t>
+      </w:r>
+      <w:r>
+        <w:rPr>
+          <w:i/>
+          <w:iCs/>
+        </w:rPr>
+        <w:t xml:space="preserve">g(x)</w:t>
+      </w:r>
+      <w:r>
+        <w:t xml:space="preserve">; </w:t>
+      </w:r>
+      <w:r>
+        <w:rPr>
+          <w:i/>
+          <w:iCs/>
+        </w:rPr>
+        <w:t xml:space="preserve">(2x(3x+1))/(x−4)</w:t>
+      </w:r>
+      <w:r>
+        <w:t xml:space="preserve"> multiplies by </w:t>
+      </w:r>
+      <w:r>
+        <w:rPr>
+          <w:i/>
+          <w:iCs/>
+        </w:rPr>
+        <w:t xml:space="preserve">h</w:t>
+      </w:r>
+      <w:r>
+        <w:t xml:space="preserve"> instead of dividing; and </w:t>
+      </w:r>
+      <w:r>
+        <w:rPr>
+          <w:i/>
+          <w:iCs/>
+        </w:rPr>
+        <w:t xml:space="preserve">(3x+1)/(2x)</w:t>
+      </w:r>
+      <w:r>
+        <w:t xml:space="preserve"> loses the </w:t>
+      </w:r>
+      <w:r>
+        <w:rPr>
+          <w:i/>
+          <w:iCs/>
+        </w:rPr>
+        <w:t xml:space="preserve">x−4</w:t>
+      </w:r>
+      <w:r>
+        <w:t xml:space="preserve"> when flipping. </w:t>
+      </w:r>
+      <w:r>
+        <w:rPr>
+          <w:b/>
+          <w:bCs/>
+          <w:i/>
+          <w:iCs/>
+        </w:rPr>
+        <w:t xml:space="preserve">((3x+1)(x−4))/(2x)</w:t>
       </w:r>
       <w:r>
         <w:rPr>
@@ -1578,7 +1498,7 @@
         <w:pageBreakBefore/>
       </w:pPr>
       <w:r>
-        <w:t xml:space="preserve">Example 4: Quotient</w:t>
+        <w:t xml:space="preserve">Example 5: Compose 1</w:t>
       </w:r>
     </w:p>
     <w:p>
@@ -1593,7 +1513,26 @@
           <w:sz w:val="40"/>
           <w:szCs w:val="40"/>
         </w:rPr>
-        <w:t xml:space="preserve">f(x)=3x−4</w:t>
+        <w:t xml:space="preserve">g(x)=x</w:t>
+      </w:r>
+      <w:r>
+        <w:rPr>
+          <w:i/>
+          <w:iCs/>
+          <w:sz w:val="40"/>
+          <w:szCs w:val="40"/>
+          <w:vertAlign w:val="superscript"/>
+        </w:rPr>
+        <w:t xml:space="preserve">2</w:t>
+      </w:r>
+      <w:r>
+        <w:rPr>
+          <w:i/>
+          <w:iCs/>
+          <w:sz w:val="40"/>
+          <w:szCs w:val="40"/>
+        </w:rPr>
+        <w:t xml:space="preserve">−3</w:t>
       </w:r>
     </w:p>
     <w:p>
@@ -1608,18 +1547,479 @@
           <w:sz w:val="40"/>
           <w:szCs w:val="40"/>
         </w:rPr>
-        <w:t xml:space="preserve">g(x)=2x</w:t>
-      </w:r>
+        <w:t xml:space="preserve">f(x)=2x+1</w:t>
+      </w:r>
+    </w:p>
+    <w:p>
+      <w:pPr>
+        <w:pStyle w:val="Heading3"/>
+        <w:keepNext/>
+      </w:pPr>
+      <w:r>
+        <w:t xml:space="preserve">Question</w:t>
+      </w:r>
+    </w:p>
+    <w:p>
+      <w:pPr>
+        <w:spacing w:after="120" w:before="80" w:line="300"/>
+      </w:pPr>
+      <w:r>
+        <w:t xml:space="preserve">Find f(g(x)).</w:t>
+      </w:r>
+    </w:p>
+    <w:p>
+      <w:pPr>
+        <w:spacing w:after="40" w:before="20"/>
+        <w:ind w:left="360"/>
+      </w:pPr>
+      <w:r>
+        <w:rPr>
+          <w:b/>
+          <w:bCs/>
+        </w:rPr>
+        <w:t xml:space="preserve">A.  </w:t>
+      </w:r>
+      <w:r>
+        <w:rPr>
+          <w:i/>
+          <w:iCs/>
+        </w:rPr>
+        <w:t xml:space="preserve">4x</w:t>
+      </w:r>
+      <w:r>
+        <w:rPr>
+          <w:i/>
+          <w:iCs/>
+          <w:vertAlign w:val="superscript"/>
+        </w:rPr>
+        <w:t xml:space="preserve">2</w:t>
+      </w:r>
+      <w:r>
+        <w:rPr>
+          <w:i/>
+          <w:iCs/>
+        </w:rPr>
+        <w:t xml:space="preserve">+4x−2</w:t>
+      </w:r>
+    </w:p>
+    <w:p>
+      <w:pPr>
+        <w:spacing w:after="40" w:before="20"/>
+        <w:ind w:left="360"/>
+      </w:pPr>
+      <w:r>
+        <w:rPr>
+          <w:b/>
+          <w:bCs/>
+        </w:rPr>
+        <w:t xml:space="preserve">B.  </w:t>
+      </w:r>
+      <w:r>
+        <w:rPr>
+          <w:i/>
+          <w:iCs/>
+        </w:rPr>
+        <w:t xml:space="preserve">2x</w:t>
+      </w:r>
+      <w:r>
+        <w:rPr>
+          <w:i/>
+          <w:iCs/>
+          <w:vertAlign w:val="superscript"/>
+        </w:rPr>
+        <w:t xml:space="preserve">2</w:t>
+      </w:r>
+      <w:r>
+        <w:rPr>
+          <w:i/>
+          <w:iCs/>
+        </w:rPr>
+        <w:t xml:space="preserve">−2</w:t>
+      </w:r>
+    </w:p>
+    <w:p>
+      <w:pPr>
+        <w:spacing w:after="40" w:before="20"/>
+        <w:ind w:left="360"/>
+      </w:pPr>
+      <w:r>
+        <w:rPr>
+          <w:b/>
+          <w:bCs/>
+        </w:rPr>
+        <w:t xml:space="preserve">C.  </w:t>
+      </w:r>
+      <w:r>
+        <w:rPr>
+          <w:i/>
+          <w:iCs/>
+        </w:rPr>
+        <w:t xml:space="preserve">2x</w:t>
+      </w:r>
+      <w:r>
+        <w:rPr>
+          <w:i/>
+          <w:iCs/>
+          <w:vertAlign w:val="superscript"/>
+        </w:rPr>
+        <w:t xml:space="preserve">3</w:t>
+      </w:r>
+      <w:r>
+        <w:rPr>
+          <w:i/>
+          <w:iCs/>
+        </w:rPr>
+        <w:t xml:space="preserve">+x</w:t>
+      </w:r>
+      <w:r>
+        <w:rPr>
+          <w:i/>
+          <w:iCs/>
+          <w:vertAlign w:val="superscript"/>
+        </w:rPr>
+        <w:t xml:space="preserve">2</w:t>
+      </w:r>
+      <w:r>
+        <w:rPr>
+          <w:i/>
+          <w:iCs/>
+        </w:rPr>
+        <w:t xml:space="preserve">−6x−3</w:t>
+      </w:r>
+    </w:p>
+    <w:p>
+      <w:pPr>
+        <w:spacing w:after="40" w:before="20"/>
+        <w:ind w:left="360"/>
+      </w:pPr>
+      <w:r>
+        <w:rPr>
+          <w:b/>
+          <w:bCs/>
+        </w:rPr>
+        <w:t xml:space="preserve">D.  </w:t>
+      </w:r>
+      <w:r>
+        <w:rPr>
+          <w:i/>
+          <w:iCs/>
+        </w:rPr>
+        <w:t xml:space="preserve">2x</w:t>
+      </w:r>
+      <w:r>
+        <w:rPr>
+          <w:i/>
+          <w:iCs/>
+          <w:vertAlign w:val="superscript"/>
+        </w:rPr>
+        <w:t xml:space="preserve">2</w:t>
+      </w:r>
+      <w:r>
+        <w:rPr>
+          <w:i/>
+          <w:iCs/>
+        </w:rPr>
+        <w:t xml:space="preserve">−5</w:t>
+      </w:r>
+    </w:p>
+    <w:p>
+      <w:pPr>
+        <w:pStyle w:val="Heading3"/>
+        <w:keepNext/>
+      </w:pPr>
+      <w:r>
+        <w:t xml:space="preserve">Answer and reasoning</w:t>
+      </w:r>
+    </w:p>
+    <w:p>
+      <w:pPr>
+        <w:spacing w:after="120" w:before="80" w:line="300"/>
+      </w:pPr>
+      <w:r>
+        <w:rPr>
+          <w:i/>
+          <w:iCs/>
+        </w:rPr>
+        <w:t xml:space="preserve">g</w:t>
+      </w:r>
+      <w:r>
+        <w:t xml:space="preserve"> is inside, so its whole formula replaces the </w:t>
+      </w:r>
+      <w:r>
+        <w:rPr>
+          <w:i/>
+          <w:iCs/>
+        </w:rPr>
+        <w:t xml:space="preserve">x</w:t>
+      </w:r>
+      <w:r>
+        <w:t xml:space="preserve"> in </w:t>
+      </w:r>
+      <w:r>
+        <w:rPr>
+          <w:i/>
+          <w:iCs/>
+        </w:rPr>
+        <w:t xml:space="preserve">f</w:t>
+      </w:r>
+      <w:r>
+        <w:t xml:space="preserve">: </w:t>
+      </w:r>
+      <w:r>
+        <w:rPr>
+          <w:i/>
+          <w:iCs/>
+        </w:rPr>
+        <w:t xml:space="preserve">f(g(x))=2(x</w:t>
+      </w:r>
+      <w:r>
+        <w:rPr>
+          <w:i/>
+          <w:iCs/>
+          <w:vertAlign w:val="superscript"/>
+        </w:rPr>
+        <w:t xml:space="preserve">2</w:t>
+      </w:r>
+      <w:r>
+        <w:rPr>
+          <w:i/>
+          <w:iCs/>
+        </w:rPr>
+        <w:t xml:space="preserve">−3)+1=2x</w:t>
+      </w:r>
+      <w:r>
+        <w:rPr>
+          <w:i/>
+          <w:iCs/>
+          <w:vertAlign w:val="superscript"/>
+        </w:rPr>
+        <w:t xml:space="preserve">2</w:t>
+      </w:r>
+      <w:r>
+        <w:rPr>
+          <w:i/>
+          <w:iCs/>
+        </w:rPr>
+        <w:t xml:space="preserve">−6+1=2x</w:t>
+      </w:r>
+      <w:r>
+        <w:rPr>
+          <w:i/>
+          <w:iCs/>
+          <w:vertAlign w:val="superscript"/>
+        </w:rPr>
+        <w:t xml:space="preserve">2</w:t>
+      </w:r>
+      <w:r>
+        <w:rPr>
+          <w:i/>
+          <w:iCs/>
+        </w:rPr>
+        <w:t xml:space="preserve">−5</w:t>
+      </w:r>
+      <w:r>
+        <w:t xml:space="preserve">. </w:t>
+      </w:r>
+      <w:r>
+        <w:rPr>
+          <w:i/>
+          <w:iCs/>
+        </w:rPr>
+        <w:t xml:space="preserve">4x</w:t>
+      </w:r>
+      <w:r>
+        <w:rPr>
+          <w:i/>
+          <w:iCs/>
+          <w:vertAlign w:val="superscript"/>
+        </w:rPr>
+        <w:t xml:space="preserve">2</w:t>
+      </w:r>
+      <w:r>
+        <w:rPr>
+          <w:i/>
+          <w:iCs/>
+        </w:rPr>
+        <w:t xml:space="preserve">+4x−2</w:t>
+      </w:r>
+      <w:r>
+        <w:t xml:space="preserve"> is </w:t>
+      </w:r>
+      <w:r>
+        <w:rPr>
+          <w:i/>
+          <w:iCs/>
+        </w:rPr>
+        <w:t xml:space="preserve">g(f(x))=(2x+1)</w:t>
+      </w:r>
+      <w:r>
+        <w:rPr>
+          <w:i/>
+          <w:iCs/>
+          <w:vertAlign w:val="superscript"/>
+        </w:rPr>
+        <w:t xml:space="preserve">2</w:t>
+      </w:r>
+      <w:r>
+        <w:rPr>
+          <w:i/>
+          <w:iCs/>
+        </w:rPr>
+        <w:t xml:space="preserve">−3</w:t>
+      </w:r>
+      <w:r>
+        <w:t xml:space="preserve">, the other order; </w:t>
+      </w:r>
+      <w:r>
+        <w:rPr>
+          <w:i/>
+          <w:iCs/>
+        </w:rPr>
+        <w:t xml:space="preserve">2x</w:t>
+      </w:r>
+      <w:r>
+        <w:rPr>
+          <w:i/>
+          <w:iCs/>
+          <w:vertAlign w:val="superscript"/>
+        </w:rPr>
+        <w:t xml:space="preserve">2</w:t>
+      </w:r>
+      <w:r>
+        <w:rPr>
+          <w:i/>
+          <w:iCs/>
+        </w:rPr>
+        <w:t xml:space="preserve">−2</w:t>
+      </w:r>
+      <w:r>
+        <w:t xml:space="preserve"> leaves out the parentheses, so the 2 never reaches the </w:t>
+      </w:r>
+      <w:r>
+        <w:rPr>
+          <w:i/>
+          <w:iCs/>
+        </w:rPr>
+        <w:t xml:space="preserve">−3</w:t>
+      </w:r>
+      <w:r>
+        <w:t xml:space="preserve">; and </w:t>
+      </w:r>
+      <w:r>
+        <w:rPr>
+          <w:i/>
+          <w:iCs/>
+        </w:rPr>
+        <w:t xml:space="preserve">2x</w:t>
+      </w:r>
+      <w:r>
+        <w:rPr>
+          <w:i/>
+          <w:iCs/>
+          <w:vertAlign w:val="superscript"/>
+        </w:rPr>
+        <w:t xml:space="preserve">3</w:t>
+      </w:r>
+      <w:r>
+        <w:rPr>
+          <w:i/>
+          <w:iCs/>
+        </w:rPr>
+        <w:t xml:space="preserve">+x</w:t>
+      </w:r>
+      <w:r>
+        <w:rPr>
+          <w:i/>
+          <w:iCs/>
+          <w:vertAlign w:val="superscript"/>
+        </w:rPr>
+        <w:t xml:space="preserve">2</w:t>
+      </w:r>
+      <w:r>
+        <w:rPr>
+          <w:i/>
+          <w:iCs/>
+        </w:rPr>
+        <w:t xml:space="preserve">−6x−3</w:t>
+      </w:r>
+      <w:r>
+        <w:t xml:space="preserve"> is the product </w:t>
+      </w:r>
+      <w:r>
+        <w:rPr>
+          <w:i/>
+          <w:iCs/>
+        </w:rPr>
+        <w:t xml:space="preserve">f(x)· g(x)</w:t>
+      </w:r>
+      <w:r>
+        <w:t xml:space="preserve">, not a composition. </w:t>
+      </w:r>
+      <w:r>
+        <w:rPr>
+          <w:b/>
+          <w:bCs/>
+          <w:i/>
+          <w:iCs/>
+        </w:rPr>
+        <w:t xml:space="preserve">2x</w:t>
+      </w:r>
+      <w:r>
+        <w:rPr>
+          <w:b/>
+          <w:bCs/>
+          <w:i/>
+          <w:iCs/>
+          <w:vertAlign w:val="superscript"/>
+        </w:rPr>
+        <w:t xml:space="preserve">2</w:t>
+      </w:r>
+      <w:r>
+        <w:rPr>
+          <w:b/>
+          <w:bCs/>
+          <w:i/>
+          <w:iCs/>
+        </w:rPr>
+        <w:t xml:space="preserve">−5</w:t>
+      </w:r>
+      <w:r>
+        <w:rPr>
+          <w:b/>
+          <w:bCs/>
+        </w:rPr>
+        <w:t xml:space="preserve">.</w:t>
+      </w:r>
+    </w:p>
+    <w:p>
+      <w:pPr>
+        <w:pStyle w:val="Heading2"/>
+        <w:pageBreakBefore/>
+      </w:pPr>
+      <w:r>
+        <w:t xml:space="preserve">Example 6: Compose 2</w:t>
+      </w:r>
+    </w:p>
+    <w:p>
+      <w:pPr>
+        <w:spacing w:after="40" w:before="200"/>
+        <w:jc w:val="center"/>
+      </w:pPr>
       <w:r>
         <w:rPr>
           <w:i/>
           <w:iCs/>
           <w:sz w:val="40"/>
           <w:szCs w:val="40"/>
-          <w:vertAlign w:val="superscript"/>
-        </w:rPr>
-        <w:t xml:space="preserve">2</w:t>
-      </w:r>
+        </w:rPr>
+        <w:t xml:space="preserve">h(x)=√(2x+3)</w:t>
+      </w:r>
+    </w:p>
+    <w:p>
+      <w:pPr>
+        <w:spacing w:after="200" w:before="40"/>
+        <w:jc w:val="center"/>
+      </w:pPr>
       <w:r>
         <w:rPr>
           <w:i/>
@@ -1627,7 +2027,26 @@
           <w:sz w:val="40"/>
           <w:szCs w:val="40"/>
         </w:rPr>
-        <w:t xml:space="preserve">+5</w:t>
+        <w:t xml:space="preserve">p(x)=x</w:t>
+      </w:r>
+      <w:r>
+        <w:rPr>
+          <w:i/>
+          <w:iCs/>
+          <w:sz w:val="40"/>
+          <w:szCs w:val="40"/>
+          <w:vertAlign w:val="superscript"/>
+        </w:rPr>
+        <w:t xml:space="preserve">2</w:t>
+      </w:r>
+      <w:r>
+        <w:rPr>
+          <w:i/>
+          <w:iCs/>
+          <w:sz w:val="40"/>
+          <w:szCs w:val="40"/>
+        </w:rPr>
+        <w:t xml:space="preserve">+1</w:t>
       </w:r>
     </w:p>
     <w:p>
@@ -1644,7 +2063,7 @@
         <w:spacing w:after="120" w:before="80" w:line="300"/>
       </w:pPr>
       <w:r>
-        <w:t xml:space="preserve">Find f(x) divided by g(x).</w:t>
+        <w:t xml:space="preserve">Find h(p(x)).</w:t>
       </w:r>
     </w:p>
     <w:p>
@@ -1664,7 +2083,27 @@
           <w:i/>
           <w:iCs/>
         </w:rPr>
-        <w:t xml:space="preserve">(3x−4)/(2x</w:t>
+        <w:t xml:space="preserve">2x+4</w:t>
+      </w:r>
+    </w:p>
+    <w:p>
+      <w:pPr>
+        <w:spacing w:after="40" w:before="20"/>
+        <w:ind w:left="360"/>
+      </w:pPr>
+      <w:r>
+        <w:rPr>
+          <w:b/>
+          <w:bCs/>
+        </w:rPr>
+        <w:t xml:space="preserve">B.  </w:t>
+      </w:r>
+      <w:r>
+        <w:rPr>
+          <w:i/>
+          <w:iCs/>
+        </w:rPr>
+        <w:t xml:space="preserve">√(2x</w:t>
       </w:r>
       <w:r>
         <w:rPr>
@@ -1692,41 +2131,6 @@
           <w:b/>
           <w:bCs/>
         </w:rPr>
-        <w:t xml:space="preserve">B.  </w:t>
-      </w:r>
-      <w:r>
-        <w:rPr>
-          <w:i/>
-          <w:iCs/>
-        </w:rPr>
-        <w:t xml:space="preserve">(2x</w:t>
-      </w:r>
-      <w:r>
-        <w:rPr>
-          <w:i/>
-          <w:iCs/>
-          <w:vertAlign w:val="superscript"/>
-        </w:rPr>
-        <w:t xml:space="preserve">2</w:t>
-      </w:r>
-      <w:r>
-        <w:rPr>
-          <w:i/>
-          <w:iCs/>
-        </w:rPr>
-        <w:t xml:space="preserve">+5)/(3x−4)</w:t>
-      </w:r>
-    </w:p>
-    <w:p>
-      <w:pPr>
-        <w:spacing w:after="40" w:before="20"/>
-        <w:ind w:left="360"/>
-      </w:pPr>
-      <w:r>
-        <w:rPr>
-          <w:b/>
-          <w:bCs/>
-        </w:rPr>
         <w:t xml:space="preserve">C.  </w:t>
       </w:r>
       <w:r>
@@ -1734,22 +2138,22 @@
           <w:i/>
           <w:iCs/>
         </w:rPr>
-        <w:t xml:space="preserve">3x−4/(2x</w:t>
-      </w:r>
-      <w:r>
-        <w:rPr>
-          <w:i/>
-          <w:iCs/>
-          <w:vertAlign w:val="superscript"/>
-        </w:rPr>
-        <w:t xml:space="preserve">2</w:t>
-      </w:r>
-      <w:r>
-        <w:rPr>
-          <w:i/>
-          <w:iCs/>
-        </w:rPr>
-        <w:t xml:space="preserve">+5)</w:t>
+        <w:t xml:space="preserve">√(2x</w:t>
+      </w:r>
+      <w:r>
+        <w:rPr>
+          <w:i/>
+          <w:iCs/>
+          <w:vertAlign w:val="superscript"/>
+        </w:rPr>
+        <w:t xml:space="preserve">2</w:t>
+      </w:r>
+      <w:r>
+        <w:rPr>
+          <w:i/>
+          <w:iCs/>
+        </w:rPr>
+        <w:t xml:space="preserve">+4)</w:t>
       </w:r>
     </w:p>
     <w:p>
@@ -1769,7 +2173,22 @@
           <w:i/>
           <w:iCs/>
         </w:rPr>
-        <w:t xml:space="preserve">3/2x−4/5</w:t>
+        <w:t xml:space="preserve">√(2x</w:t>
+      </w:r>
+      <w:r>
+        <w:rPr>
+          <w:i/>
+          <w:iCs/>
+          <w:vertAlign w:val="superscript"/>
+        </w:rPr>
+        <w:t xml:space="preserve">2</w:t>
+      </w:r>
+      <w:r>
+        <w:rPr>
+          <w:i/>
+          <w:iCs/>
+        </w:rPr>
+        <w:t xml:space="preserve">+3)+1</w:t>
       </w:r>
     </w:p>
     <w:p>
@@ -1786,34 +2205,86 @@
         <w:spacing w:after="120" w:before="80" w:line="300"/>
       </w:pPr>
       <w:r>
-        <w:t xml:space="preserve">The whole formula for </w:t>
-      </w:r>
-      <w:r>
-        <w:rPr>
-          <w:i/>
-          <w:iCs/>
-        </w:rPr>
-        <w:t xml:space="preserve">f</w:t>
-      </w:r>
-      <w:r>
-        <w:t xml:space="preserve"> goes on top and the whole formula for </w:t>
-      </w:r>
-      <w:r>
-        <w:rPr>
-          <w:i/>
-          <w:iCs/>
-        </w:rPr>
-        <w:t xml:space="preserve">g</w:t>
-      </w:r>
-      <w:r>
-        <w:t xml:space="preserve"> goes on the bottom: </w:t>
-      </w:r>
-      <w:r>
-        <w:rPr>
-          <w:i/>
-          <w:iCs/>
-        </w:rPr>
-        <w:t xml:space="preserve">(3x−4)/(2x</w:t>
+        <w:rPr>
+          <w:i/>
+          <w:iCs/>
+        </w:rPr>
+        <w:t xml:space="preserve">p</w:t>
+      </w:r>
+      <w:r>
+        <w:t xml:space="preserve"> is inside, so </w:t>
+      </w:r>
+      <w:r>
+        <w:rPr>
+          <w:i/>
+          <w:iCs/>
+        </w:rPr>
+        <w:t xml:space="preserve">x</w:t>
+      </w:r>
+      <w:r>
+        <w:rPr>
+          <w:i/>
+          <w:iCs/>
+          <w:vertAlign w:val="superscript"/>
+        </w:rPr>
+        <w:t xml:space="preserve">2</w:t>
+      </w:r>
+      <w:r>
+        <w:rPr>
+          <w:i/>
+          <w:iCs/>
+        </w:rPr>
+        <w:t xml:space="preserve">+1</w:t>
+      </w:r>
+      <w:r>
+        <w:t xml:space="preserve"> replaces the </w:t>
+      </w:r>
+      <w:r>
+        <w:rPr>
+          <w:i/>
+          <w:iCs/>
+        </w:rPr>
+        <w:t xml:space="preserve">x</w:t>
+      </w:r>
+      <w:r>
+        <w:t xml:space="preserve"> under the root: </w:t>
+      </w:r>
+      <w:r>
+        <w:rPr>
+          <w:i/>
+          <w:iCs/>
+        </w:rPr>
+        <w:t xml:space="preserve">h(p(x))=√(2(x</w:t>
+      </w:r>
+      <w:r>
+        <w:rPr>
+          <w:i/>
+          <w:iCs/>
+          <w:vertAlign w:val="superscript"/>
+        </w:rPr>
+        <w:t xml:space="preserve">2</w:t>
+      </w:r>
+      <w:r>
+        <w:rPr>
+          <w:i/>
+          <w:iCs/>
+        </w:rPr>
+        <w:t xml:space="preserve">+1)+3)=√(2x</w:t>
+      </w:r>
+      <w:r>
+        <w:rPr>
+          <w:i/>
+          <w:iCs/>
+          <w:vertAlign w:val="superscript"/>
+        </w:rPr>
+        <w:t xml:space="preserve">2</w:t>
+      </w:r>
+      <w:r>
+        <w:rPr>
+          <w:i/>
+          <w:iCs/>
+        </w:rPr>
+        <w:t xml:space="preserve">+2+3)=√(2x</w:t>
       </w:r>
       <w:r>
         <w:rPr>
@@ -1831,91 +2302,149 @@
         <w:t xml:space="preserve">+5)</w:t>
       </w:r>
       <w:r>
-        <w:t xml:space="preserve">. Nothing cancels, because no factor is shared. Flipping it gives </w:t>
-      </w:r>
-      <w:r>
-        <w:rPr>
-          <w:i/>
-          <w:iCs/>
-        </w:rPr>
-        <w:t xml:space="preserve">g(x)</w:t>
-      </w:r>
-      <w:r>
-        <w:t xml:space="preserve"> divided by </w:t>
-      </w:r>
-      <w:r>
-        <w:rPr>
-          <w:i/>
-          <w:iCs/>
-        </w:rPr>
-        <w:t xml:space="preserve">f(x)</w:t>
-      </w:r>
-      <w:r>
-        <w:t xml:space="preserve">; </w:t>
-      </w:r>
-      <w:r>
-        <w:rPr>
-          <w:i/>
-          <w:iCs/>
-        </w:rPr>
-        <w:t xml:space="preserve">3x−4/(2x</w:t>
-      </w:r>
-      <w:r>
-        <w:rPr>
-          <w:i/>
-          <w:iCs/>
-          <w:vertAlign w:val="superscript"/>
-        </w:rPr>
-        <w:t xml:space="preserve">2</w:t>
-      </w:r>
-      <w:r>
-        <w:rPr>
-          <w:i/>
-          <w:iCs/>
-        </w:rPr>
-        <w:t xml:space="preserve">+5)</w:t>
-      </w:r>
-      <w:r>
-        <w:t xml:space="preserve"> divides only the </w:t>
-      </w:r>
-      <w:r>
-        <w:rPr>
-          <w:i/>
-          <w:iCs/>
-        </w:rPr>
-        <w:t xml:space="preserve">−4</w:t>
-      </w:r>
-      <w:r>
-        <w:t xml:space="preserve">, which is what happens when the parentheses around </w:t>
-      </w:r>
-      <w:r>
-        <w:rPr>
-          <w:i/>
-          <w:iCs/>
-        </w:rPr>
-        <w:t xml:space="preserve">3x−4</w:t>
-      </w:r>
-      <w:r>
-        <w:t xml:space="preserve"> are left off; and dividing term by term, </w:t>
-      </w:r>
-      <w:r>
-        <w:rPr>
-          <w:i/>
-          <w:iCs/>
-        </w:rPr>
-        <w:t xml:space="preserve">3/2x−4/5</w:t>
-      </w:r>
-      <w:r>
-        <w:t xml:space="preserve">, is not allowed when the bottom has more than one term. </w:t>
-      </w:r>
-      <w:r>
-        <w:rPr>
-          <w:b/>
-          <w:bCs/>
-          <w:i/>
-          <w:iCs/>
-        </w:rPr>
-        <w:t xml:space="preserve">(3x−4)/(2x</w:t>
+        <w:t xml:space="preserve">. </w:t>
+      </w:r>
+      <w:r>
+        <w:rPr>
+          <w:i/>
+          <w:iCs/>
+        </w:rPr>
+        <w:t xml:space="preserve">2x+4</w:t>
+      </w:r>
+      <w:r>
+        <w:t xml:space="preserve"> is </w:t>
+      </w:r>
+      <w:r>
+        <w:rPr>
+          <w:i/>
+          <w:iCs/>
+        </w:rPr>
+        <w:t xml:space="preserve">p(h(x))=(√(2x+3))</w:t>
+      </w:r>
+      <w:r>
+        <w:rPr>
+          <w:i/>
+          <w:iCs/>
+          <w:vertAlign w:val="superscript"/>
+        </w:rPr>
+        <w:t xml:space="preserve">2</w:t>
+      </w:r>
+      <w:r>
+        <w:rPr>
+          <w:i/>
+          <w:iCs/>
+        </w:rPr>
+        <w:t xml:space="preserve">+1</w:t>
+      </w:r>
+      <w:r>
+        <w:t xml:space="preserve">, the other order; </w:t>
+      </w:r>
+      <w:r>
+        <w:rPr>
+          <w:i/>
+          <w:iCs/>
+        </w:rPr>
+        <w:t xml:space="preserve">√(2x</w:t>
+      </w:r>
+      <w:r>
+        <w:rPr>
+          <w:i/>
+          <w:iCs/>
+          <w:vertAlign w:val="superscript"/>
+        </w:rPr>
+        <w:t xml:space="preserve">2</w:t>
+      </w:r>
+      <w:r>
+        <w:rPr>
+          <w:i/>
+          <w:iCs/>
+        </w:rPr>
+        <w:t xml:space="preserve">+4)</w:t>
+      </w:r>
+      <w:r>
+        <w:t xml:space="preserve"> multiplies only the </w:t>
+      </w:r>
+      <w:r>
+        <w:rPr>
+          <w:i/>
+          <w:iCs/>
+        </w:rPr>
+        <w:t xml:space="preserve">x</w:t>
+      </w:r>
+      <w:r>
+        <w:rPr>
+          <w:i/>
+          <w:iCs/>
+          <w:vertAlign w:val="superscript"/>
+        </w:rPr>
+        <w:t xml:space="preserve">2</w:t>
+      </w:r>
+      <w:r>
+        <w:t xml:space="preserve"> by 2, not the 1; and </w:t>
+      </w:r>
+      <w:r>
+        <w:rPr>
+          <w:i/>
+          <w:iCs/>
+        </w:rPr>
+        <w:t xml:space="preserve">√(2x</w:t>
+      </w:r>
+      <w:r>
+        <w:rPr>
+          <w:i/>
+          <w:iCs/>
+          <w:vertAlign w:val="superscript"/>
+        </w:rPr>
+        <w:t xml:space="preserve">2</w:t>
+      </w:r>
+      <w:r>
+        <w:rPr>
+          <w:i/>
+          <w:iCs/>
+        </w:rPr>
+        <w:t xml:space="preserve">+3)+1</w:t>
+      </w:r>
+      <w:r>
+        <w:t xml:space="preserve"> puts the </w:t>
+      </w:r>
+      <w:r>
+        <w:rPr>
+          <w:i/>
+          <w:iCs/>
+        </w:rPr>
+        <w:t xml:space="preserve">+1</w:t>
+      </w:r>
+      <w:r>
+        <w:t xml:space="preserve"> from </w:t>
+      </w:r>
+      <w:r>
+        <w:rPr>
+          <w:i/>
+          <w:iCs/>
+        </w:rPr>
+        <w:t xml:space="preserve">p</w:t>
+      </w:r>
+      <w:r>
+        <w:t xml:space="preserve"> outside the root instead of inside, where </w:t>
+      </w:r>
+      <w:r>
+        <w:rPr>
+          <w:i/>
+          <w:iCs/>
+        </w:rPr>
+        <w:t xml:space="preserve">x</w:t>
+      </w:r>
+      <w:r>
+        <w:t xml:space="preserve"> was. </w:t>
+      </w:r>
+      <w:r>
+        <w:rPr>
+          <w:b/>
+          <w:bCs/>
+          <w:i/>
+          <w:iCs/>
+        </w:rPr>
+        <w:t xml:space="preserve">√(2x</w:t>
       </w:r>
       <w:r>
         <w:rPr>
@@ -1950,7 +2479,7 @@
         <w:pageBreakBefore/>
       </w:pPr>
       <w:r>
-        <w:t xml:space="preserve">Example 5: Compose 1</w:t>
+        <w:t xml:space="preserve">Example 7: Compose 3</w:t>
       </w:r>
     </w:p>
     <w:p>
@@ -1965,7 +2494,7 @@
           <w:sz w:val="40"/>
           <w:szCs w:val="40"/>
         </w:rPr>
-        <w:t xml:space="preserve">f(x)=2x+1</w:t>
+        <w:t xml:space="preserve">q(x)=4x−1</w:t>
       </w:r>
     </w:p>
     <w:p>
@@ -1980,18 +2509,278 @@
           <w:sz w:val="40"/>
           <w:szCs w:val="40"/>
         </w:rPr>
-        <w:t xml:space="preserve">g(x)=x</w:t>
-      </w:r>
+        <w:t xml:space="preserve">r(x)=2x/(x+3)</w:t>
+      </w:r>
+    </w:p>
+    <w:p>
+      <w:pPr>
+        <w:pStyle w:val="Heading3"/>
+        <w:keepNext/>
+      </w:pPr>
+      <w:r>
+        <w:t xml:space="preserve">Question</w:t>
+      </w:r>
+    </w:p>
+    <w:p>
+      <w:pPr>
+        <w:spacing w:after="120" w:before="80" w:line="300"/>
+      </w:pPr>
+      <w:r>
+        <w:t xml:space="preserve">Find r(q(x)).</w:t>
+      </w:r>
+    </w:p>
+    <w:p>
+      <w:pPr>
+        <w:spacing w:after="40" w:before="20"/>
+        <w:ind w:left="360"/>
+      </w:pPr>
+      <w:r>
+        <w:rPr>
+          <w:b/>
+          <w:bCs/>
+        </w:rPr>
+        <w:t xml:space="preserve">A.  </w:t>
+      </w:r>
+      <w:r>
+        <w:rPr>
+          <w:i/>
+          <w:iCs/>
+        </w:rPr>
+        <w:t xml:space="preserve">8x/(x+3)−1</w:t>
+      </w:r>
+    </w:p>
+    <w:p>
+      <w:pPr>
+        <w:spacing w:after="40" w:before="20"/>
+        <w:ind w:left="360"/>
+      </w:pPr>
+      <w:r>
+        <w:rPr>
+          <w:b/>
+          <w:bCs/>
+        </w:rPr>
+        <w:t xml:space="preserve">B.  </w:t>
+      </w:r>
+      <w:r>
+        <w:rPr>
+          <w:i/>
+          <w:iCs/>
+        </w:rPr>
+        <w:t xml:space="preserve">(8x−2)/(x+3)</w:t>
+      </w:r>
+    </w:p>
+    <w:p>
+      <w:pPr>
+        <w:spacing w:after="40" w:before="20"/>
+        <w:ind w:left="360"/>
+      </w:pPr>
+      <w:r>
+        <w:rPr>
+          <w:b/>
+          <w:bCs/>
+        </w:rPr>
+        <w:t xml:space="preserve">C.  </w:t>
+      </w:r>
+      <w:r>
+        <w:rPr>
+          <w:i/>
+          <w:iCs/>
+        </w:rPr>
+        <w:t xml:space="preserve">(8x−2)/(4x+2)</w:t>
+      </w:r>
+    </w:p>
+    <w:p>
+      <w:pPr>
+        <w:spacing w:after="40" w:before="20"/>
+        <w:ind w:left="360"/>
+      </w:pPr>
+      <w:r>
+        <w:rPr>
+          <w:b/>
+          <w:bCs/>
+        </w:rPr>
+        <w:t xml:space="preserve">D.  </w:t>
+      </w:r>
+      <w:r>
+        <w:rPr>
+          <w:i/>
+          <w:iCs/>
+        </w:rPr>
+        <w:t xml:space="preserve">(8x−1)/(4x+2)</w:t>
+      </w:r>
+    </w:p>
+    <w:p>
+      <w:pPr>
+        <w:pStyle w:val="Heading3"/>
+        <w:keepNext/>
+      </w:pPr>
+      <w:r>
+        <w:t xml:space="preserve">Answer and reasoning</w:t>
+      </w:r>
+    </w:p>
+    <w:p>
+      <w:pPr>
+        <w:spacing w:after="120" w:before="80" w:line="300"/>
+      </w:pPr>
+      <w:r>
+        <w:t xml:space="preserve">Replace both </w:t>
+      </w:r>
+      <w:r>
+        <w:rPr>
+          <w:i/>
+          <w:iCs/>
+        </w:rPr>
+        <w:t xml:space="preserve">x</w:t>
+      </w:r>
+      <w:r>
+        <w:t xml:space="preserve">'s in </w:t>
+      </w:r>
+      <w:r>
+        <w:rPr>
+          <w:i/>
+          <w:iCs/>
+        </w:rPr>
+        <w:t xml:space="preserve">r</w:t>
+      </w:r>
+      <w:r>
+        <w:t xml:space="preserve">, top and bottom, with </w:t>
+      </w:r>
+      <w:r>
+        <w:rPr>
+          <w:i/>
+          <w:iCs/>
+        </w:rPr>
+        <w:t xml:space="preserve">(4x−1)</w:t>
+      </w:r>
+      <w:r>
+        <w:t xml:space="preserve">: </w:t>
+      </w:r>
+      <w:r>
+        <w:rPr>
+          <w:i/>
+          <w:iCs/>
+        </w:rPr>
+        <w:t xml:space="preserve">r(q(x))=(2(4x−1))/((4x−1)+3)=(8x−2)/(4x+2)</w:t>
+      </w:r>
+      <w:r>
+        <w:t xml:space="preserve">. It also simplifies to </w:t>
+      </w:r>
+      <w:r>
+        <w:rPr>
+          <w:i/>
+          <w:iCs/>
+        </w:rPr>
+        <w:t xml:space="preserve">(4x−1)/(2x+1)</w:t>
+      </w:r>
+      <w:r>
+        <w:t xml:space="preserve">, dividing top and bottom by 2. </w:t>
+      </w:r>
+      <w:r>
+        <w:rPr>
+          <w:i/>
+          <w:iCs/>
+        </w:rPr>
+        <w:t xml:space="preserve">8x/(x+3)−1</w:t>
+      </w:r>
+      <w:r>
+        <w:t xml:space="preserve"> is </w:t>
+      </w:r>
+      <w:r>
+        <w:rPr>
+          <w:i/>
+          <w:iCs/>
+        </w:rPr>
+        <w:t xml:space="preserve">q(r(x))</w:t>
+      </w:r>
+      <w:r>
+        <w:t xml:space="preserve">, the other order; </w:t>
+      </w:r>
+      <w:r>
+        <w:rPr>
+          <w:i/>
+          <w:iCs/>
+        </w:rPr>
+        <w:t xml:space="preserve">(8x−2)/(x+3)</w:t>
+      </w:r>
+      <w:r>
+        <w:t xml:space="preserve"> replaces only the </w:t>
+      </w:r>
+      <w:r>
+        <w:rPr>
+          <w:i/>
+          <w:iCs/>
+        </w:rPr>
+        <w:t xml:space="preserve">x</w:t>
+      </w:r>
+      <w:r>
+        <w:t xml:space="preserve"> on top; and </w:t>
+      </w:r>
+      <w:r>
+        <w:rPr>
+          <w:i/>
+          <w:iCs/>
+        </w:rPr>
+        <w:t xml:space="preserve">8x−1</w:t>
+      </w:r>
+      <w:r>
+        <w:t xml:space="preserve"> multiplies only the </w:t>
+      </w:r>
+      <w:r>
+        <w:rPr>
+          <w:i/>
+          <w:iCs/>
+        </w:rPr>
+        <w:t xml:space="preserve">4x</w:t>
+      </w:r>
+      <w:r>
+        <w:t xml:space="preserve"> by 2. </w:t>
+      </w:r>
+      <w:r>
+        <w:rPr>
+          <w:b/>
+          <w:bCs/>
+          <w:i/>
+          <w:iCs/>
+        </w:rPr>
+        <w:t xml:space="preserve">(8x−2)/(4x+2)</w:t>
+      </w:r>
+      <w:r>
+        <w:rPr>
+          <w:b/>
+          <w:bCs/>
+        </w:rPr>
+        <w:t xml:space="preserve">.</w:t>
+      </w:r>
+    </w:p>
+    <w:p>
+      <w:pPr>
+        <w:pStyle w:val="Heading2"/>
+        <w:pageBreakBefore/>
+      </w:pPr>
+      <w:r>
+        <w:t xml:space="preserve">Example 8: Compose 4</w:t>
+      </w:r>
+    </w:p>
+    <w:p>
+      <w:pPr>
+        <w:spacing w:after="40" w:before="200"/>
+        <w:jc w:val="center"/>
+      </w:pPr>
       <w:r>
         <w:rPr>
           <w:i/>
           <w:iCs/>
           <w:sz w:val="40"/>
           <w:szCs w:val="40"/>
-          <w:vertAlign w:val="superscript"/>
-        </w:rPr>
-        <w:t xml:space="preserve">2</w:t>
-      </w:r>
+        </w:rPr>
+        <w:t xml:space="preserve">r(x)=x/(x+2)</w:t>
+      </w:r>
+    </w:p>
+    <w:p>
+      <w:pPr>
+        <w:spacing w:after="200" w:before="40"/>
+        <w:jc w:val="center"/>
+      </w:pPr>
       <w:r>
         <w:rPr>
           <w:i/>
@@ -1999,7 +2788,26 @@
           <w:sz w:val="40"/>
           <w:szCs w:val="40"/>
         </w:rPr>
-        <w:t xml:space="preserve">−3</w:t>
+        <w:t xml:space="preserve">q(x)=2x</w:t>
+      </w:r>
+      <w:r>
+        <w:rPr>
+          <w:i/>
+          <w:iCs/>
+          <w:sz w:val="40"/>
+          <w:szCs w:val="40"/>
+          <w:vertAlign w:val="superscript"/>
+        </w:rPr>
+        <w:t xml:space="preserve">2</w:t>
+      </w:r>
+      <w:r>
+        <w:rPr>
+          <w:i/>
+          <w:iCs/>
+          <w:sz w:val="40"/>
+          <w:szCs w:val="40"/>
+        </w:rPr>
+        <w:t xml:space="preserve">−1</w:t>
       </w:r>
     </w:p>
     <w:p>
@@ -2016,7 +2824,7 @@
         <w:spacing w:after="120" w:before="80" w:line="300"/>
       </w:pPr>
       <w:r>
-        <w:t xml:space="preserve">Find f(g(x)).</w:t>
+        <w:t xml:space="preserve">Find q(r(x)).</w:t>
       </w:r>
     </w:p>
     <w:p>
@@ -2036,22 +2844,37 @@
           <w:i/>
           <w:iCs/>
         </w:rPr>
-        <w:t xml:space="preserve">4x</w:t>
-      </w:r>
-      <w:r>
-        <w:rPr>
-          <w:i/>
-          <w:iCs/>
-          <w:vertAlign w:val="superscript"/>
-        </w:rPr>
-        <w:t xml:space="preserve">2</w:t>
-      </w:r>
-      <w:r>
-        <w:rPr>
-          <w:i/>
-          <w:iCs/>
-        </w:rPr>
-        <w:t xml:space="preserve">+4x−2</w:t>
+        <w:t xml:space="preserve">(2x</w:t>
+      </w:r>
+      <w:r>
+        <w:rPr>
+          <w:i/>
+          <w:iCs/>
+          <w:vertAlign w:val="superscript"/>
+        </w:rPr>
+        <w:t xml:space="preserve">2</w:t>
+      </w:r>
+      <w:r>
+        <w:rPr>
+          <w:i/>
+          <w:iCs/>
+        </w:rPr>
+        <w:t xml:space="preserve">−1)/(2x</w:t>
+      </w:r>
+      <w:r>
+        <w:rPr>
+          <w:i/>
+          <w:iCs/>
+          <w:vertAlign w:val="superscript"/>
+        </w:rPr>
+        <w:t xml:space="preserve">2</w:t>
+      </w:r>
+      <w:r>
+        <w:rPr>
+          <w:i/>
+          <w:iCs/>
+        </w:rPr>
+        <w:t xml:space="preserve">+1)</w:t>
       </w:r>
     </w:p>
     <w:p>
@@ -2071,22 +2894,22 @@
           <w:i/>
           <w:iCs/>
         </w:rPr>
-        <w:t xml:space="preserve">2x</w:t>
-      </w:r>
-      <w:r>
-        <w:rPr>
-          <w:i/>
-          <w:iCs/>
-          <w:vertAlign w:val="superscript"/>
-        </w:rPr>
-        <w:t xml:space="preserve">2</w:t>
-      </w:r>
-      <w:r>
-        <w:rPr>
-          <w:i/>
-          <w:iCs/>
-        </w:rPr>
-        <w:t xml:space="preserve">−2</w:t>
+        <w:t xml:space="preserve">2(x</w:t>
+      </w:r>
+      <w:r>
+        <w:rPr>
+          <w:i/>
+          <w:iCs/>
+          <w:vertAlign w:val="superscript"/>
+        </w:rPr>
+        <w:t xml:space="preserve">2</w:t>
+      </w:r>
+      <w:r>
+        <w:rPr>
+          <w:i/>
+          <w:iCs/>
+        </w:rPr>
+        <w:t xml:space="preserve">/(x+2))−1</w:t>
       </w:r>
     </w:p>
     <w:p>
@@ -2106,37 +2929,22 @@
           <w:i/>
           <w:iCs/>
         </w:rPr>
-        <w:t xml:space="preserve">2x</w:t>
-      </w:r>
-      <w:r>
-        <w:rPr>
-          <w:i/>
-          <w:iCs/>
-          <w:vertAlign w:val="superscript"/>
-        </w:rPr>
-        <w:t xml:space="preserve">3</w:t>
-      </w:r>
-      <w:r>
-        <w:rPr>
-          <w:i/>
-          <w:iCs/>
-        </w:rPr>
-        <w:t xml:space="preserve">+x</w:t>
-      </w:r>
-      <w:r>
-        <w:rPr>
-          <w:i/>
-          <w:iCs/>
-          <w:vertAlign w:val="superscript"/>
-        </w:rPr>
-        <w:t xml:space="preserve">2</w:t>
-      </w:r>
-      <w:r>
-        <w:rPr>
-          <w:i/>
-          <w:iCs/>
-        </w:rPr>
-        <w:t xml:space="preserve">−6x−3</w:t>
+        <w:t xml:space="preserve">(2x</w:t>
+      </w:r>
+      <w:r>
+        <w:rPr>
+          <w:i/>
+          <w:iCs/>
+          <w:vertAlign w:val="superscript"/>
+        </w:rPr>
+        <w:t xml:space="preserve">2</w:t>
+      </w:r>
+      <w:r>
+        <w:rPr>
+          <w:i/>
+          <w:iCs/>
+        </w:rPr>
+        <w:t xml:space="preserve">−1)(x/(x+2))</w:t>
       </w:r>
     </w:p>
     <w:p>
@@ -2156,22 +2964,22 @@
           <w:i/>
           <w:iCs/>
         </w:rPr>
-        <w:t xml:space="preserve">2x</w:t>
-      </w:r>
-      <w:r>
-        <w:rPr>
-          <w:i/>
-          <w:iCs/>
-          <w:vertAlign w:val="superscript"/>
-        </w:rPr>
-        <w:t xml:space="preserve">2</w:t>
-      </w:r>
-      <w:r>
-        <w:rPr>
-          <w:i/>
-          <w:iCs/>
-        </w:rPr>
-        <w:t xml:space="preserve">−5</w:t>
+        <w:t xml:space="preserve">2(x/(x+2))</w:t>
+      </w:r>
+      <w:r>
+        <w:rPr>
+          <w:i/>
+          <w:iCs/>
+          <w:vertAlign w:val="superscript"/>
+        </w:rPr>
+        <w:t xml:space="preserve">2</w:t>
+      </w:r>
+      <w:r>
+        <w:rPr>
+          <w:i/>
+          <w:iCs/>
+        </w:rPr>
+        <w:t xml:space="preserve">−1</w:t>
       </w:r>
     </w:p>
     <w:p>
@@ -2192,10 +3000,30 @@
           <w:i/>
           <w:iCs/>
         </w:rPr>
-        <w:t xml:space="preserve">g</w:t>
-      </w:r>
-      <w:r>
-        <w:t xml:space="preserve"> is inside, so its whole formula replaces the </w:t>
+        <w:t xml:space="preserve">r</w:t>
+      </w:r>
+      <w:r>
+        <w:t xml:space="preserve"> is listed first, but the letters decide: in </w:t>
+      </w:r>
+      <w:r>
+        <w:rPr>
+          <w:i/>
+          <w:iCs/>
+        </w:rPr>
+        <w:t xml:space="preserve">q(r(x))</w:t>
+      </w:r>
+      <w:r>
+        <w:t xml:space="preserve">, </w:t>
+      </w:r>
+      <w:r>
+        <w:rPr>
+          <w:i/>
+          <w:iCs/>
+        </w:rPr>
+        <w:t xml:space="preserve">r</w:t>
+      </w:r>
+      <w:r>
+        <w:t xml:space="preserve"> is inside. Replace the </w:t>
       </w:r>
       <w:r>
         <w:rPr>
@@ -2212,62 +3040,72 @@
           <w:i/>
           <w:iCs/>
         </w:rPr>
-        <w:t xml:space="preserve">f</w:t>
-      </w:r>
-      <w:r>
-        <w:t xml:space="preserve">: </w:t>
-      </w:r>
-      <w:r>
-        <w:rPr>
-          <w:i/>
-          <w:iCs/>
-        </w:rPr>
-        <w:t xml:space="preserve">f(g(x))=2(x</w:t>
-      </w:r>
-      <w:r>
-        <w:rPr>
-          <w:i/>
-          <w:iCs/>
-          <w:vertAlign w:val="superscript"/>
-        </w:rPr>
-        <w:t xml:space="preserve">2</w:t>
-      </w:r>
-      <w:r>
-        <w:rPr>
-          <w:i/>
-          <w:iCs/>
-        </w:rPr>
-        <w:t xml:space="preserve">−3)+1=2x</w:t>
-      </w:r>
-      <w:r>
-        <w:rPr>
-          <w:i/>
-          <w:iCs/>
-          <w:vertAlign w:val="superscript"/>
-        </w:rPr>
-        <w:t xml:space="preserve">2</w:t>
-      </w:r>
-      <w:r>
-        <w:rPr>
-          <w:i/>
-          <w:iCs/>
-        </w:rPr>
-        <w:t xml:space="preserve">−6+1=2x</w:t>
-      </w:r>
-      <w:r>
-        <w:rPr>
-          <w:i/>
-          <w:iCs/>
-          <w:vertAlign w:val="superscript"/>
-        </w:rPr>
-        <w:t xml:space="preserve">2</w:t>
-      </w:r>
-      <w:r>
-        <w:rPr>
-          <w:i/>
-          <w:iCs/>
-        </w:rPr>
-        <w:t xml:space="preserve">−5</w:t>
+        <w:t xml:space="preserve">q</w:t>
+      </w:r>
+      <w:r>
+        <w:t xml:space="preserve"> with the whole fraction: </w:t>
+      </w:r>
+      <w:r>
+        <w:rPr>
+          <w:i/>
+          <w:iCs/>
+        </w:rPr>
+        <w:t xml:space="preserve">q(r(x))=2(x/(x+2))</w:t>
+      </w:r>
+      <w:r>
+        <w:rPr>
+          <w:i/>
+          <w:iCs/>
+          <w:vertAlign w:val="superscript"/>
+        </w:rPr>
+        <w:t xml:space="preserve">2</w:t>
+      </w:r>
+      <w:r>
+        <w:rPr>
+          <w:i/>
+          <w:iCs/>
+        </w:rPr>
+        <w:t xml:space="preserve">−1</w:t>
+      </w:r>
+      <w:r>
+        <w:t xml:space="preserve">, which is how CheckIt leaves it. It also equals </w:t>
+      </w:r>
+      <w:r>
+        <w:rPr>
+          <w:i/>
+          <w:iCs/>
+        </w:rPr>
+        <w:t xml:space="preserve">(2x</w:t>
+      </w:r>
+      <w:r>
+        <w:rPr>
+          <w:i/>
+          <w:iCs/>
+          <w:vertAlign w:val="superscript"/>
+        </w:rPr>
+        <w:t xml:space="preserve">2</w:t>
+      </w:r>
+      <w:r>
+        <w:rPr>
+          <w:i/>
+          <w:iCs/>
+        </w:rPr>
+        <w:t xml:space="preserve">)/((x+2)</w:t>
+      </w:r>
+      <w:r>
+        <w:rPr>
+          <w:i/>
+          <w:iCs/>
+          <w:vertAlign w:val="superscript"/>
+        </w:rPr>
+        <w:t xml:space="preserve">2</w:t>
+      </w:r>
+      <w:r>
+        <w:rPr>
+          <w:i/>
+          <w:iCs/>
+        </w:rPr>
+        <w:t xml:space="preserve">)−1</w:t>
       </w:r>
       <w:r>
         <w:t xml:space="preserve">. </w:t>
@@ -2277,22 +3115,37 @@
           <w:i/>
           <w:iCs/>
         </w:rPr>
-        <w:t xml:space="preserve">4x</w:t>
-      </w:r>
-      <w:r>
-        <w:rPr>
-          <w:i/>
-          <w:iCs/>
-          <w:vertAlign w:val="superscript"/>
-        </w:rPr>
-        <w:t xml:space="preserve">2</w:t>
-      </w:r>
-      <w:r>
-        <w:rPr>
-          <w:i/>
-          <w:iCs/>
-        </w:rPr>
-        <w:t xml:space="preserve">+4x−2</w:t>
+        <w:t xml:space="preserve">(2x</w:t>
+      </w:r>
+      <w:r>
+        <w:rPr>
+          <w:i/>
+          <w:iCs/>
+          <w:vertAlign w:val="superscript"/>
+        </w:rPr>
+        <w:t xml:space="preserve">2</w:t>
+      </w:r>
+      <w:r>
+        <w:rPr>
+          <w:i/>
+          <w:iCs/>
+        </w:rPr>
+        <w:t xml:space="preserve">−1)/(2x</w:t>
+      </w:r>
+      <w:r>
+        <w:rPr>
+          <w:i/>
+          <w:iCs/>
+          <w:vertAlign w:val="superscript"/>
+        </w:rPr>
+        <w:t xml:space="preserve">2</w:t>
+      </w:r>
+      <w:r>
+        <w:rPr>
+          <w:i/>
+          <w:iCs/>
+        </w:rPr>
+        <w:t xml:space="preserve">+1)</w:t>
       </w:r>
       <w:r>
         <w:t xml:space="preserve"> is </w:t>
@@ -2302,22 +3155,7 @@
           <w:i/>
           <w:iCs/>
         </w:rPr>
-        <w:t xml:space="preserve">g(f(x))=(2x+1)</w:t>
-      </w:r>
-      <w:r>
-        <w:rPr>
-          <w:i/>
-          <w:iCs/>
-          <w:vertAlign w:val="superscript"/>
-        </w:rPr>
-        <w:t xml:space="preserve">2</w:t>
-      </w:r>
-      <w:r>
-        <w:rPr>
-          <w:i/>
-          <w:iCs/>
-        </w:rPr>
-        <w:t xml:space="preserve">−3</w:t>
+        <w:t xml:space="preserve">r(q(x))</w:t>
       </w:r>
       <w:r>
         <w:t xml:space="preserve">, the other order; </w:t>
@@ -2327,72 +3165,47 @@
           <w:i/>
           <w:iCs/>
         </w:rPr>
-        <w:t xml:space="preserve">2x</w:t>
-      </w:r>
-      <w:r>
-        <w:rPr>
-          <w:i/>
-          <w:iCs/>
-          <w:vertAlign w:val="superscript"/>
-        </w:rPr>
-        <w:t xml:space="preserve">2</w:t>
-      </w:r>
-      <w:r>
-        <w:rPr>
-          <w:i/>
-          <w:iCs/>
-        </w:rPr>
-        <w:t xml:space="preserve">−2</w:t>
-      </w:r>
-      <w:r>
-        <w:t xml:space="preserve"> leaves out the parentheses, so the 2 never reaches the </w:t>
-      </w:r>
-      <w:r>
-        <w:rPr>
-          <w:i/>
-          <w:iCs/>
-        </w:rPr>
-        <w:t xml:space="preserve">−3</w:t>
-      </w:r>
-      <w:r>
-        <w:t xml:space="preserve">; and </w:t>
-      </w:r>
-      <w:r>
-        <w:rPr>
-          <w:i/>
-          <w:iCs/>
-        </w:rPr>
-        <w:t xml:space="preserve">2x</w:t>
-      </w:r>
-      <w:r>
-        <w:rPr>
-          <w:i/>
-          <w:iCs/>
-          <w:vertAlign w:val="superscript"/>
-        </w:rPr>
-        <w:t xml:space="preserve">3</w:t>
-      </w:r>
-      <w:r>
-        <w:rPr>
-          <w:i/>
-          <w:iCs/>
-        </w:rPr>
-        <w:t xml:space="preserve">+x</w:t>
-      </w:r>
-      <w:r>
-        <w:rPr>
-          <w:i/>
-          <w:iCs/>
-          <w:vertAlign w:val="superscript"/>
-        </w:rPr>
-        <w:t xml:space="preserve">2</w:t>
-      </w:r>
-      <w:r>
-        <w:rPr>
-          <w:i/>
-          <w:iCs/>
-        </w:rPr>
-        <w:t xml:space="preserve">−6x−3</w:t>
+        <w:t xml:space="preserve">2(x</w:t>
+      </w:r>
+      <w:r>
+        <w:rPr>
+          <w:i/>
+          <w:iCs/>
+          <w:vertAlign w:val="superscript"/>
+        </w:rPr>
+        <w:t xml:space="preserve">2</w:t>
+      </w:r>
+      <w:r>
+        <w:rPr>
+          <w:i/>
+          <w:iCs/>
+        </w:rPr>
+        <w:t xml:space="preserve">/(x+2))−1</w:t>
+      </w:r>
+      <w:r>
+        <w:t xml:space="preserve"> squares the top of the fraction but not the bottom; and </w:t>
+      </w:r>
+      <w:r>
+        <w:rPr>
+          <w:i/>
+          <w:iCs/>
+        </w:rPr>
+        <w:t xml:space="preserve">(2x</w:t>
+      </w:r>
+      <w:r>
+        <w:rPr>
+          <w:i/>
+          <w:iCs/>
+          <w:vertAlign w:val="superscript"/>
+        </w:rPr>
+        <w:t xml:space="preserve">2</w:t>
+      </w:r>
+      <w:r>
+        <w:rPr>
+          <w:i/>
+          <w:iCs/>
+        </w:rPr>
+        <w:t xml:space="preserve">−1)(x/(x+2))</w:t>
       </w:r>
       <w:r>
         <w:t xml:space="preserve"> is the product </w:t>
@@ -2402,1197 +3215,38 @@
           <w:i/>
           <w:iCs/>
         </w:rPr>
-        <w:t xml:space="preserve">f(x)· g(x)</w:t>
-      </w:r>
-      <w:r>
-        <w:t xml:space="preserve">, not a composition. </w:t>
-      </w:r>
-      <w:r>
-        <w:rPr>
-          <w:b/>
-          <w:bCs/>
-          <w:i/>
-          <w:iCs/>
-        </w:rPr>
-        <w:t xml:space="preserve">2x</w:t>
-      </w:r>
-      <w:r>
-        <w:rPr>
-          <w:b/>
-          <w:bCs/>
-          <w:i/>
-          <w:iCs/>
-          <w:vertAlign w:val="superscript"/>
-        </w:rPr>
-        <w:t xml:space="preserve">2</w:t>
-      </w:r>
-      <w:r>
-        <w:rPr>
-          <w:b/>
-          <w:bCs/>
-          <w:i/>
-          <w:iCs/>
-        </w:rPr>
-        <w:t xml:space="preserve">−5</w:t>
-      </w:r>
-      <w:r>
-        <w:rPr>
-          <w:b/>
-          <w:bCs/>
-        </w:rPr>
-        <w:t xml:space="preserve">.</w:t>
-      </w:r>
-    </w:p>
-    <w:p>
-      <w:pPr>
-        <w:pStyle w:val="Heading2"/>
-        <w:pageBreakBefore/>
-      </w:pPr>
-      <w:r>
-        <w:t xml:space="preserve">Example 6: Compose 2</w:t>
-      </w:r>
-    </w:p>
-    <w:p>
-      <w:pPr>
-        <w:spacing w:after="40" w:before="200"/>
-        <w:jc w:val="center"/>
-      </w:pPr>
-      <w:r>
-        <w:rPr>
-          <w:i/>
-          <w:iCs/>
-          <w:sz w:val="40"/>
-          <w:szCs w:val="40"/>
-        </w:rPr>
-        <w:t xml:space="preserve">h(x)=√(2x+3)</w:t>
-      </w:r>
-    </w:p>
-    <w:p>
-      <w:pPr>
-        <w:spacing w:after="200" w:before="40"/>
-        <w:jc w:val="center"/>
-      </w:pPr>
-      <w:r>
-        <w:rPr>
-          <w:i/>
-          <w:iCs/>
-          <w:sz w:val="40"/>
-          <w:szCs w:val="40"/>
-        </w:rPr>
-        <w:t xml:space="preserve">k(x)=x</w:t>
-      </w:r>
-      <w:r>
-        <w:rPr>
-          <w:i/>
-          <w:iCs/>
-          <w:sz w:val="40"/>
-          <w:szCs w:val="40"/>
-          <w:vertAlign w:val="superscript"/>
-        </w:rPr>
-        <w:t xml:space="preserve">2</w:t>
-      </w:r>
-      <w:r>
-        <w:rPr>
-          <w:i/>
-          <w:iCs/>
-          <w:sz w:val="40"/>
-          <w:szCs w:val="40"/>
-        </w:rPr>
-        <w:t xml:space="preserve">+1</w:t>
-      </w:r>
-    </w:p>
-    <w:p>
-      <w:pPr>
-        <w:pStyle w:val="Heading3"/>
-        <w:keepNext/>
-      </w:pPr>
-      <w:r>
-        <w:t xml:space="preserve">Question</w:t>
-      </w:r>
-    </w:p>
-    <w:p>
-      <w:pPr>
-        <w:spacing w:after="120" w:before="80" w:line="300"/>
-      </w:pPr>
-      <w:r>
-        <w:t xml:space="preserve">Find h(k(x)).</w:t>
-      </w:r>
-    </w:p>
-    <w:p>
-      <w:pPr>
-        <w:spacing w:after="40" w:before="20"/>
-        <w:ind w:left="360"/>
-      </w:pPr>
-      <w:r>
-        <w:rPr>
-          <w:b/>
-          <w:bCs/>
-        </w:rPr>
-        <w:t xml:space="preserve">A.  </w:t>
-      </w:r>
-      <w:r>
-        <w:rPr>
-          <w:i/>
-          <w:iCs/>
-        </w:rPr>
-        <w:t xml:space="preserve">2x+4</w:t>
-      </w:r>
-    </w:p>
-    <w:p>
-      <w:pPr>
-        <w:spacing w:after="40" w:before="20"/>
-        <w:ind w:left="360"/>
-      </w:pPr>
-      <w:r>
-        <w:rPr>
-          <w:b/>
-          <w:bCs/>
-        </w:rPr>
-        <w:t xml:space="preserve">B.  </w:t>
-      </w:r>
-      <w:r>
-        <w:rPr>
-          <w:i/>
-          <w:iCs/>
-        </w:rPr>
-        <w:t xml:space="preserve">√(2x</w:t>
-      </w:r>
-      <w:r>
-        <w:rPr>
-          <w:i/>
-          <w:iCs/>
-          <w:vertAlign w:val="superscript"/>
-        </w:rPr>
-        <w:t xml:space="preserve">2</w:t>
-      </w:r>
-      <w:r>
-        <w:rPr>
-          <w:i/>
-          <w:iCs/>
-        </w:rPr>
-        <w:t xml:space="preserve">+5)</w:t>
-      </w:r>
-    </w:p>
-    <w:p>
-      <w:pPr>
-        <w:spacing w:after="40" w:before="20"/>
-        <w:ind w:left="360"/>
-      </w:pPr>
-      <w:r>
-        <w:rPr>
-          <w:b/>
-          <w:bCs/>
-        </w:rPr>
-        <w:t xml:space="preserve">C.  </w:t>
-      </w:r>
-      <w:r>
-        <w:rPr>
-          <w:i/>
-          <w:iCs/>
-        </w:rPr>
-        <w:t xml:space="preserve">√(2x</w:t>
-      </w:r>
-      <w:r>
-        <w:rPr>
-          <w:i/>
-          <w:iCs/>
-          <w:vertAlign w:val="superscript"/>
-        </w:rPr>
-        <w:t xml:space="preserve">2</w:t>
-      </w:r>
-      <w:r>
-        <w:rPr>
-          <w:i/>
-          <w:iCs/>
-        </w:rPr>
-        <w:t xml:space="preserve">+4)</w:t>
-      </w:r>
-    </w:p>
-    <w:p>
-      <w:pPr>
-        <w:spacing w:after="40" w:before="20"/>
-        <w:ind w:left="360"/>
-      </w:pPr>
-      <w:r>
-        <w:rPr>
-          <w:b/>
-          <w:bCs/>
-        </w:rPr>
-        <w:t xml:space="preserve">D.  </w:t>
-      </w:r>
-      <w:r>
-        <w:rPr>
-          <w:i/>
-          <w:iCs/>
-        </w:rPr>
-        <w:t xml:space="preserve">√(2x</w:t>
-      </w:r>
-      <w:r>
-        <w:rPr>
-          <w:i/>
-          <w:iCs/>
-          <w:vertAlign w:val="superscript"/>
-        </w:rPr>
-        <w:t xml:space="preserve">2</w:t>
-      </w:r>
-      <w:r>
-        <w:rPr>
-          <w:i/>
-          <w:iCs/>
-        </w:rPr>
-        <w:t xml:space="preserve">+3)+1</w:t>
-      </w:r>
-    </w:p>
-    <w:p>
-      <w:pPr>
-        <w:pStyle w:val="Heading3"/>
-        <w:keepNext/>
-      </w:pPr>
-      <w:r>
-        <w:t xml:space="preserve">Answer and reasoning</w:t>
-      </w:r>
-    </w:p>
-    <w:p>
-      <w:pPr>
-        <w:spacing w:after="120" w:before="80" w:line="300"/>
-      </w:pPr>
-      <w:r>
-        <w:rPr>
-          <w:i/>
-          <w:iCs/>
-        </w:rPr>
-        <w:t xml:space="preserve">k</w:t>
-      </w:r>
-      <w:r>
-        <w:t xml:space="preserve"> is inside, so </w:t>
-      </w:r>
-      <w:r>
-        <w:rPr>
-          <w:i/>
-          <w:iCs/>
-        </w:rPr>
-        <w:t xml:space="preserve">x</w:t>
-      </w:r>
-      <w:r>
-        <w:rPr>
-          <w:i/>
-          <w:iCs/>
-          <w:vertAlign w:val="superscript"/>
-        </w:rPr>
-        <w:t xml:space="preserve">2</w:t>
-      </w:r>
-      <w:r>
-        <w:rPr>
-          <w:i/>
-          <w:iCs/>
-        </w:rPr>
-        <w:t xml:space="preserve">+1</w:t>
-      </w:r>
-      <w:r>
-        <w:t xml:space="preserve"> replaces the </w:t>
-      </w:r>
-      <w:r>
-        <w:rPr>
-          <w:i/>
-          <w:iCs/>
-        </w:rPr>
-        <w:t xml:space="preserve">x</w:t>
-      </w:r>
-      <w:r>
-        <w:t xml:space="preserve"> under the root: </w:t>
-      </w:r>
-      <w:r>
-        <w:rPr>
-          <w:i/>
-          <w:iCs/>
-        </w:rPr>
-        <w:t xml:space="preserve">h(k(x))=√(2(x</w:t>
-      </w:r>
-      <w:r>
-        <w:rPr>
-          <w:i/>
-          <w:iCs/>
-          <w:vertAlign w:val="superscript"/>
-        </w:rPr>
-        <w:t xml:space="preserve">2</w:t>
-      </w:r>
-      <w:r>
-        <w:rPr>
-          <w:i/>
-          <w:iCs/>
-        </w:rPr>
-        <w:t xml:space="preserve">+1)+3)=√(2x</w:t>
-      </w:r>
-      <w:r>
-        <w:rPr>
-          <w:i/>
-          <w:iCs/>
-          <w:vertAlign w:val="superscript"/>
-        </w:rPr>
-        <w:t xml:space="preserve">2</w:t>
-      </w:r>
-      <w:r>
-        <w:rPr>
-          <w:i/>
-          <w:iCs/>
-        </w:rPr>
-        <w:t xml:space="preserve">+2+3)=√(2x</w:t>
-      </w:r>
-      <w:r>
-        <w:rPr>
-          <w:i/>
-          <w:iCs/>
-          <w:vertAlign w:val="superscript"/>
-        </w:rPr>
-        <w:t xml:space="preserve">2</w:t>
-      </w:r>
-      <w:r>
-        <w:rPr>
-          <w:i/>
-          <w:iCs/>
-        </w:rPr>
-        <w:t xml:space="preserve">+5)</w:t>
+        <w:t xml:space="preserve">q(x)· r(x)</w:t>
       </w:r>
       <w:r>
         <w:t xml:space="preserve">. </w:t>
       </w:r>
       <w:r>
         <w:rPr>
-          <w:i/>
-          <w:iCs/>
-        </w:rPr>
-        <w:t xml:space="preserve">2x+4</w:t>
-      </w:r>
-      <w:r>
-        <w:t xml:space="preserve"> is </w:t>
-      </w:r>
-      <w:r>
-        <w:rPr>
-          <w:i/>
-          <w:iCs/>
-        </w:rPr>
-        <w:t xml:space="preserve">k(h(x))=(√(2x+3))</w:t>
-      </w:r>
-      <w:r>
-        <w:rPr>
-          <w:i/>
-          <w:iCs/>
-          <w:vertAlign w:val="superscript"/>
-        </w:rPr>
-        <w:t xml:space="preserve">2</w:t>
-      </w:r>
-      <w:r>
-        <w:rPr>
-          <w:i/>
-          <w:iCs/>
-        </w:rPr>
-        <w:t xml:space="preserve">+1</w:t>
-      </w:r>
-      <w:r>
-        <w:t xml:space="preserve">, the other order; </w:t>
-      </w:r>
-      <w:r>
-        <w:rPr>
-          <w:i/>
-          <w:iCs/>
-        </w:rPr>
-        <w:t xml:space="preserve">√(2x</w:t>
-      </w:r>
-      <w:r>
-        <w:rPr>
-          <w:i/>
-          <w:iCs/>
-          <w:vertAlign w:val="superscript"/>
-        </w:rPr>
-        <w:t xml:space="preserve">2</w:t>
-      </w:r>
-      <w:r>
-        <w:rPr>
-          <w:i/>
-          <w:iCs/>
-        </w:rPr>
-        <w:t xml:space="preserve">+4)</w:t>
-      </w:r>
-      <w:r>
-        <w:t xml:space="preserve"> multiplies only the </w:t>
-      </w:r>
-      <w:r>
-        <w:rPr>
-          <w:i/>
-          <w:iCs/>
-        </w:rPr>
-        <w:t xml:space="preserve">x</w:t>
-      </w:r>
-      <w:r>
-        <w:rPr>
-          <w:i/>
-          <w:iCs/>
-          <w:vertAlign w:val="superscript"/>
-        </w:rPr>
-        <w:t xml:space="preserve">2</w:t>
-      </w:r>
-      <w:r>
-        <w:t xml:space="preserve"> by 2, not the 1; and </w:t>
-      </w:r>
-      <w:r>
-        <w:rPr>
-          <w:i/>
-          <w:iCs/>
-        </w:rPr>
-        <w:t xml:space="preserve">√(2x</w:t>
-      </w:r>
-      <w:r>
-        <w:rPr>
-          <w:i/>
-          <w:iCs/>
-          <w:vertAlign w:val="superscript"/>
-        </w:rPr>
-        <w:t xml:space="preserve">2</w:t>
-      </w:r>
-      <w:r>
-        <w:rPr>
-          <w:i/>
-          <w:iCs/>
-        </w:rPr>
-        <w:t xml:space="preserve">+3)+1</w:t>
-      </w:r>
-      <w:r>
-        <w:t xml:space="preserve"> puts the </w:t>
-      </w:r>
-      <w:r>
-        <w:rPr>
-          <w:i/>
-          <w:iCs/>
-        </w:rPr>
-        <w:t xml:space="preserve">+1</w:t>
-      </w:r>
-      <w:r>
-        <w:t xml:space="preserve"> from </w:t>
-      </w:r>
-      <w:r>
-        <w:rPr>
-          <w:i/>
-          <w:iCs/>
-        </w:rPr>
-        <w:t xml:space="preserve">k</w:t>
-      </w:r>
-      <w:r>
-        <w:t xml:space="preserve"> outside the root instead of inside, where </w:t>
-      </w:r>
-      <w:r>
-        <w:rPr>
-          <w:i/>
-          <w:iCs/>
-        </w:rPr>
-        <w:t xml:space="preserve">x</w:t>
-      </w:r>
-      <w:r>
-        <w:t xml:space="preserve"> was. </w:t>
-      </w:r>
-      <w:r>
-        <w:rPr>
-          <w:b/>
-          <w:bCs/>
-          <w:i/>
-          <w:iCs/>
-        </w:rPr>
-        <w:t xml:space="preserve">√(2x</w:t>
-      </w:r>
-      <w:r>
-        <w:rPr>
-          <w:b/>
-          <w:bCs/>
-          <w:i/>
-          <w:iCs/>
-          <w:vertAlign w:val="superscript"/>
-        </w:rPr>
-        <w:t xml:space="preserve">2</w:t>
-      </w:r>
-      <w:r>
-        <w:rPr>
-          <w:b/>
-          <w:bCs/>
-          <w:i/>
-          <w:iCs/>
-        </w:rPr>
-        <w:t xml:space="preserve">+5)</w:t>
-      </w:r>
-      <w:r>
-        <w:rPr>
-          <w:b/>
-          <w:bCs/>
-        </w:rPr>
-        <w:t xml:space="preserve">.</w:t>
-      </w:r>
-    </w:p>
-    <w:p>
-      <w:pPr>
-        <w:pStyle w:val="Heading2"/>
-        <w:pageBreakBefore/>
-      </w:pPr>
-      <w:r>
-        <w:t xml:space="preserve">Example 7: Compose 3</w:t>
-      </w:r>
-    </w:p>
-    <w:p>
-      <w:pPr>
-        <w:spacing w:after="40" w:before="200"/>
-        <w:jc w:val="center"/>
-      </w:pPr>
-      <w:r>
-        <w:rPr>
-          <w:i/>
-          <w:iCs/>
-          <w:sz w:val="40"/>
-          <w:szCs w:val="40"/>
-        </w:rPr>
-        <w:t xml:space="preserve">r(x)=2x/(x+3)</w:t>
-      </w:r>
-    </w:p>
-    <w:p>
-      <w:pPr>
-        <w:spacing w:after="200" w:before="40"/>
-        <w:jc w:val="center"/>
-      </w:pPr>
-      <w:r>
-        <w:rPr>
-          <w:i/>
-          <w:iCs/>
-          <w:sz w:val="40"/>
-          <w:szCs w:val="40"/>
-        </w:rPr>
-        <w:t xml:space="preserve">q(x)=4x−1</w:t>
-      </w:r>
-    </w:p>
-    <w:p>
-      <w:pPr>
-        <w:pStyle w:val="Heading3"/>
-        <w:keepNext/>
-      </w:pPr>
-      <w:r>
-        <w:t xml:space="preserve">Question</w:t>
-      </w:r>
-    </w:p>
-    <w:p>
-      <w:pPr>
-        <w:spacing w:after="120" w:before="80" w:line="300"/>
-      </w:pPr>
-      <w:r>
-        <w:t xml:space="preserve">Find r(q(x)).</w:t>
-      </w:r>
-    </w:p>
-    <w:p>
-      <w:pPr>
-        <w:spacing w:after="40" w:before="20"/>
-        <w:ind w:left="360"/>
-      </w:pPr>
-      <w:r>
-        <w:rPr>
-          <w:b/>
-          <w:bCs/>
-        </w:rPr>
-        <w:t xml:space="preserve">A.  </w:t>
-      </w:r>
-      <w:r>
-        <w:rPr>
-          <w:i/>
-          <w:iCs/>
-        </w:rPr>
-        <w:t xml:space="preserve">8x/(x+3)−1</w:t>
-      </w:r>
-    </w:p>
-    <w:p>
-      <w:pPr>
-        <w:spacing w:after="40" w:before="20"/>
-        <w:ind w:left="360"/>
-      </w:pPr>
-      <w:r>
-        <w:rPr>
-          <w:b/>
-          <w:bCs/>
-        </w:rPr>
-        <w:t xml:space="preserve">B.  </w:t>
-      </w:r>
-      <w:r>
-        <w:rPr>
-          <w:i/>
-          <w:iCs/>
-        </w:rPr>
-        <w:t xml:space="preserve">(8x−2)/(x+3)</w:t>
-      </w:r>
-    </w:p>
-    <w:p>
-      <w:pPr>
-        <w:spacing w:after="40" w:before="20"/>
-        <w:ind w:left="360"/>
-      </w:pPr>
-      <w:r>
-        <w:rPr>
-          <w:b/>
-          <w:bCs/>
-        </w:rPr>
-        <w:t xml:space="preserve">C.  </w:t>
-      </w:r>
-      <w:r>
-        <w:rPr>
-          <w:i/>
-          <w:iCs/>
-        </w:rPr>
-        <w:t xml:space="preserve">(8x−2)/(4x+2)</w:t>
-      </w:r>
-    </w:p>
-    <w:p>
-      <w:pPr>
-        <w:spacing w:after="40" w:before="20"/>
-        <w:ind w:left="360"/>
-      </w:pPr>
-      <w:r>
-        <w:rPr>
-          <w:b/>
-          <w:bCs/>
-        </w:rPr>
-        <w:t xml:space="preserve">D.  </w:t>
-      </w:r>
-      <w:r>
-        <w:rPr>
-          <w:i/>
-          <w:iCs/>
-        </w:rPr>
-        <w:t xml:space="preserve">(8x−1)/(4x+2)</w:t>
-      </w:r>
-    </w:p>
-    <w:p>
-      <w:pPr>
-        <w:pStyle w:val="Heading3"/>
-        <w:keepNext/>
-      </w:pPr>
-      <w:r>
-        <w:t xml:space="preserve">Answer and reasoning</w:t>
-      </w:r>
-    </w:p>
-    <w:p>
-      <w:pPr>
-        <w:spacing w:after="120" w:before="80" w:line="300"/>
-      </w:pPr>
-      <w:r>
-        <w:t xml:space="preserve">Replace both </w:t>
-      </w:r>
-      <w:r>
-        <w:rPr>
-          <w:i/>
-          <w:iCs/>
-        </w:rPr>
-        <w:t xml:space="preserve">x</w:t>
-      </w:r>
-      <w:r>
-        <w:t xml:space="preserve">'s in </w:t>
-      </w:r>
-      <w:r>
-        <w:rPr>
-          <w:i/>
-          <w:iCs/>
-        </w:rPr>
-        <w:t xml:space="preserve">r</w:t>
-      </w:r>
-      <w:r>
-        <w:t xml:space="preserve">, top and bottom, with </w:t>
-      </w:r>
-      <w:r>
-        <w:rPr>
-          <w:i/>
-          <w:iCs/>
-        </w:rPr>
-        <w:t xml:space="preserve">(4x−1)</w:t>
-      </w:r>
-      <w:r>
-        <w:t xml:space="preserve">: </w:t>
-      </w:r>
-      <w:r>
-        <w:rPr>
-          <w:i/>
-          <w:iCs/>
-        </w:rPr>
-        <w:t xml:space="preserve">r(q(x))=(2(4x−1))/((4x−1)+3)=(8x−2)/(4x+2)</w:t>
-      </w:r>
-      <w:r>
-        <w:t xml:space="preserve">. It also simplifies to </w:t>
-      </w:r>
-      <w:r>
-        <w:rPr>
-          <w:i/>
-          <w:iCs/>
-        </w:rPr>
-        <w:t xml:space="preserve">(4x−1)/(2x+1)</w:t>
-      </w:r>
-      <w:r>
-        <w:t xml:space="preserve">, dividing top and bottom by 2. </w:t>
-      </w:r>
-      <w:r>
-        <w:rPr>
-          <w:i/>
-          <w:iCs/>
-        </w:rPr>
-        <w:t xml:space="preserve">8x/(x+3)−1</w:t>
-      </w:r>
-      <w:r>
-        <w:t xml:space="preserve"> is </w:t>
-      </w:r>
-      <w:r>
-        <w:rPr>
-          <w:i/>
-          <w:iCs/>
-        </w:rPr>
-        <w:t xml:space="preserve">q(r(x))</w:t>
-      </w:r>
-      <w:r>
-        <w:t xml:space="preserve">, the other order; </w:t>
-      </w:r>
-      <w:r>
-        <w:rPr>
-          <w:i/>
-          <w:iCs/>
-        </w:rPr>
-        <w:t xml:space="preserve">(8x−2)/(x+3)</w:t>
-      </w:r>
-      <w:r>
-        <w:t xml:space="preserve"> replaces only the </w:t>
-      </w:r>
-      <w:r>
-        <w:rPr>
-          <w:i/>
-          <w:iCs/>
-        </w:rPr>
-        <w:t xml:space="preserve">x</w:t>
-      </w:r>
-      <w:r>
-        <w:t xml:space="preserve"> on top; and </w:t>
-      </w:r>
-      <w:r>
-        <w:rPr>
-          <w:i/>
-          <w:iCs/>
-        </w:rPr>
-        <w:t xml:space="preserve">8x−1</w:t>
-      </w:r>
-      <w:r>
-        <w:t xml:space="preserve"> multiplies only the </w:t>
-      </w:r>
-      <w:r>
-        <w:rPr>
-          <w:i/>
-          <w:iCs/>
-        </w:rPr>
-        <w:t xml:space="preserve">4x</w:t>
-      </w:r>
-      <w:r>
-        <w:t xml:space="preserve"> by 2. </w:t>
-      </w:r>
-      <w:r>
-        <w:rPr>
-          <w:b/>
-          <w:bCs/>
-          <w:i/>
-          <w:iCs/>
-        </w:rPr>
-        <w:t xml:space="preserve">(8x−2)/(4x+2)</w:t>
-      </w:r>
-      <w:r>
-        <w:rPr>
-          <w:b/>
-          <w:bCs/>
-        </w:rPr>
-        <w:t xml:space="preserve">.</w:t>
-      </w:r>
-    </w:p>
-    <w:p>
-      <w:pPr>
-        <w:pStyle w:val="Heading2"/>
-        <w:pageBreakBefore/>
-      </w:pPr>
-      <w:r>
-        <w:t xml:space="preserve">Example 8: Which One?</w:t>
-      </w:r>
-    </w:p>
-    <w:p>
-      <w:pPr>
-        <w:spacing w:after="40" w:before="200"/>
-        <w:jc w:val="center"/>
-      </w:pPr>
-      <w:r>
-        <w:rPr>
-          <w:i/>
-          <w:iCs/>
-          <w:sz w:val="40"/>
-          <w:szCs w:val="40"/>
-        </w:rPr>
-        <w:t xml:space="preserve">h(x)=x</w:t>
-      </w:r>
-      <w:r>
-        <w:rPr>
-          <w:i/>
-          <w:iCs/>
-          <w:sz w:val="40"/>
-          <w:szCs w:val="40"/>
-          <w:vertAlign w:val="superscript"/>
-        </w:rPr>
-        <w:t xml:space="preserve">3</w:t>
-      </w:r>
-    </w:p>
-    <w:p>
-      <w:pPr>
-        <w:spacing w:after="200" w:before="40"/>
-        <w:jc w:val="center"/>
-      </w:pPr>
-      <w:r>
-        <w:rPr>
-          <w:i/>
-          <w:iCs/>
-          <w:sz w:val="40"/>
-          <w:szCs w:val="40"/>
-        </w:rPr>
-        <w:t xml:space="preserve">p(x)=x+2</w:t>
-      </w:r>
-    </w:p>
-    <w:p>
-      <w:pPr>
-        <w:pStyle w:val="Heading3"/>
-        <w:keepNext/>
-      </w:pPr>
-      <w:r>
-        <w:t xml:space="preserve">Question</w:t>
-      </w:r>
-    </w:p>
-    <w:p>
-      <w:pPr>
-        <w:spacing w:after="120" w:before="80" w:line="300"/>
-      </w:pPr>
-      <w:r>
-        <w:t xml:space="preserve">Which formula is h(p(x))?</w:t>
-      </w:r>
-    </w:p>
-    <w:p>
-      <w:pPr>
-        <w:spacing w:after="40" w:before="20"/>
-        <w:ind w:left="360"/>
-      </w:pPr>
-      <w:r>
-        <w:rPr>
-          <w:b/>
-          <w:bCs/>
-        </w:rPr>
-        <w:t xml:space="preserve">A.  </w:t>
-      </w:r>
-      <w:r>
-        <w:rPr>
-          <w:i/>
-          <w:iCs/>
-        </w:rPr>
-        <w:t xml:space="preserve">x</w:t>
-      </w:r>
-      <w:r>
-        <w:rPr>
-          <w:i/>
-          <w:iCs/>
-          <w:vertAlign w:val="superscript"/>
-        </w:rPr>
-        <w:t xml:space="preserve">3</w:t>
-      </w:r>
-      <w:r>
-        <w:rPr>
-          <w:i/>
-          <w:iCs/>
-        </w:rPr>
-        <w:t xml:space="preserve">+2</w:t>
-      </w:r>
-    </w:p>
-    <w:p>
-      <w:pPr>
-        <w:spacing w:after="40" w:before="20"/>
-        <w:ind w:left="360"/>
-      </w:pPr>
-      <w:r>
-        <w:rPr>
-          <w:b/>
-          <w:bCs/>
-        </w:rPr>
-        <w:t xml:space="preserve">B.  </w:t>
-      </w:r>
-      <w:r>
-        <w:rPr>
-          <w:i/>
-          <w:iCs/>
-        </w:rPr>
-        <w:t xml:space="preserve">x</w:t>
-      </w:r>
-      <w:r>
-        <w:rPr>
-          <w:i/>
-          <w:iCs/>
-          <w:vertAlign w:val="superscript"/>
-        </w:rPr>
-        <w:t xml:space="preserve">4</w:t>
-      </w:r>
-      <w:r>
-        <w:rPr>
-          <w:i/>
-          <w:iCs/>
-        </w:rPr>
-        <w:t xml:space="preserve">+2x</w:t>
-      </w:r>
-      <w:r>
-        <w:rPr>
-          <w:i/>
-          <w:iCs/>
-          <w:vertAlign w:val="superscript"/>
-        </w:rPr>
-        <w:t xml:space="preserve">3</w:t>
-      </w:r>
-    </w:p>
-    <w:p>
-      <w:pPr>
-        <w:spacing w:after="40" w:before="20"/>
-        <w:ind w:left="360"/>
-      </w:pPr>
-      <w:r>
-        <w:rPr>
-          <w:b/>
-          <w:bCs/>
-        </w:rPr>
-        <w:t xml:space="preserve">C.  </w:t>
-      </w:r>
-      <w:r>
-        <w:rPr>
-          <w:i/>
-          <w:iCs/>
-        </w:rPr>
-        <w:t xml:space="preserve">x</w:t>
-      </w:r>
-      <w:r>
-        <w:rPr>
-          <w:i/>
-          <w:iCs/>
-          <w:vertAlign w:val="superscript"/>
-        </w:rPr>
-        <w:t xml:space="preserve">3</w:t>
-      </w:r>
-      <w:r>
-        <w:rPr>
-          <w:i/>
-          <w:iCs/>
-        </w:rPr>
-        <w:t xml:space="preserve">+x+2</w:t>
-      </w:r>
-    </w:p>
-    <w:p>
-      <w:pPr>
-        <w:spacing w:after="40" w:before="20"/>
-        <w:ind w:left="360"/>
-      </w:pPr>
-      <w:r>
-        <w:rPr>
-          <w:b/>
-          <w:bCs/>
-        </w:rPr>
-        <w:t xml:space="preserve">D.  </w:t>
-      </w:r>
-      <w:r>
-        <w:rPr>
-          <w:i/>
-          <w:iCs/>
-        </w:rPr>
-        <w:t xml:space="preserve">(x+2)</w:t>
-      </w:r>
-      <w:r>
-        <w:rPr>
-          <w:i/>
-          <w:iCs/>
-          <w:vertAlign w:val="superscript"/>
-        </w:rPr>
-        <w:t xml:space="preserve">3</w:t>
-      </w:r>
-    </w:p>
-    <w:p>
-      <w:pPr>
-        <w:pStyle w:val="Heading3"/>
-        <w:keepNext/>
-      </w:pPr>
-      <w:r>
-        <w:t xml:space="preserve">Answer and reasoning</w:t>
-      </w:r>
-    </w:p>
-    <w:p>
-      <w:pPr>
-        <w:spacing w:after="120" w:before="80" w:line="300"/>
-      </w:pPr>
-      <w:r>
-        <w:rPr>
-          <w:i/>
-          <w:iCs/>
-        </w:rPr>
-        <w:t xml:space="preserve">p</w:t>
-      </w:r>
-      <w:r>
-        <w:t xml:space="preserve"> is inside, so its output, </w:t>
-      </w:r>
-      <w:r>
-        <w:rPr>
-          <w:i/>
-          <w:iCs/>
-        </w:rPr>
-        <w:t xml:space="preserve">x+2</w:t>
-      </w:r>
-      <w:r>
-        <w:t xml:space="preserve">, is what gets cubed: </w:t>
-      </w:r>
-      <w:r>
-        <w:rPr>
-          <w:i/>
-          <w:iCs/>
-        </w:rPr>
-        <w:t xml:space="preserve">h(p(x))=(x+2)</w:t>
-      </w:r>
-      <w:r>
-        <w:rPr>
-          <w:i/>
-          <w:iCs/>
-          <w:vertAlign w:val="superscript"/>
-        </w:rPr>
-        <w:t xml:space="preserve">3</w:t>
-      </w:r>
-      <w:r>
-        <w:t xml:space="preserve">. </w:t>
-      </w:r>
-      <w:r>
-        <w:rPr>
-          <w:i/>
-          <w:iCs/>
-        </w:rPr>
-        <w:t xml:space="preserve">x</w:t>
-      </w:r>
-      <w:r>
-        <w:rPr>
-          <w:i/>
-          <w:iCs/>
-          <w:vertAlign w:val="superscript"/>
-        </w:rPr>
-        <w:t xml:space="preserve">3</w:t>
-      </w:r>
-      <w:r>
-        <w:rPr>
-          <w:i/>
-          <w:iCs/>
-        </w:rPr>
-        <w:t xml:space="preserve">+2</w:t>
-      </w:r>
-      <w:r>
-        <w:t xml:space="preserve"> cubes first and then adds 2, which is </w:t>
-      </w:r>
-      <w:r>
-        <w:rPr>
-          <w:i/>
-          <w:iCs/>
-        </w:rPr>
-        <w:t xml:space="preserve">p(h(x))</w:t>
-      </w:r>
-      <w:r>
-        <w:t xml:space="preserve">; </w:t>
-      </w:r>
-      <w:r>
-        <w:rPr>
-          <w:i/>
-          <w:iCs/>
-        </w:rPr>
-        <w:t xml:space="preserve">x</w:t>
-      </w:r>
-      <w:r>
-        <w:rPr>
-          <w:i/>
-          <w:iCs/>
-          <w:vertAlign w:val="superscript"/>
-        </w:rPr>
-        <w:t xml:space="preserve">4</w:t>
-      </w:r>
-      <w:r>
-        <w:rPr>
-          <w:i/>
-          <w:iCs/>
-        </w:rPr>
-        <w:t xml:space="preserve">+2x</w:t>
-      </w:r>
-      <w:r>
-        <w:rPr>
-          <w:i/>
-          <w:iCs/>
-          <w:vertAlign w:val="superscript"/>
-        </w:rPr>
-        <w:t xml:space="preserve">3</w:t>
-      </w:r>
-      <w:r>
-        <w:t xml:space="preserve"> is the product </w:t>
-      </w:r>
-      <w:r>
-        <w:rPr>
-          <w:i/>
-          <w:iCs/>
-        </w:rPr>
-        <w:t xml:space="preserve">h(x)· p(x)</w:t>
-      </w:r>
-      <w:r>
-        <w:t xml:space="preserve">; and </w:t>
-      </w:r>
-      <w:r>
-        <w:rPr>
-          <w:i/>
-          <w:iCs/>
-        </w:rPr>
-        <w:t xml:space="preserve">x</w:t>
-      </w:r>
-      <w:r>
-        <w:rPr>
-          <w:i/>
-          <w:iCs/>
-          <w:vertAlign w:val="superscript"/>
-        </w:rPr>
-        <w:t xml:space="preserve">3</w:t>
-      </w:r>
-      <w:r>
-        <w:rPr>
-          <w:i/>
-          <w:iCs/>
-        </w:rPr>
-        <w:t xml:space="preserve">+x+2</w:t>
-      </w:r>
-      <w:r>
-        <w:t xml:space="preserve"> is the sum </w:t>
-      </w:r>
-      <w:r>
-        <w:rPr>
-          <w:i/>
-          <w:iCs/>
-        </w:rPr>
-        <w:t xml:space="preserve">h(x)+p(x)</w:t>
-      </w:r>
-      <w:r>
-        <w:t xml:space="preserve">. </w:t>
-      </w:r>
-      <w:r>
-        <w:rPr>
-          <w:b/>
-          <w:bCs/>
-          <w:i/>
-          <w:iCs/>
-        </w:rPr>
-        <w:t xml:space="preserve">(x+2)</w:t>
-      </w:r>
-      <w:r>
-        <w:rPr>
-          <w:b/>
-          <w:bCs/>
-          <w:i/>
-          <w:iCs/>
-          <w:vertAlign w:val="superscript"/>
-        </w:rPr>
-        <w:t xml:space="preserve">3</w:t>
+          <w:b/>
+          <w:bCs/>
+          <w:i/>
+          <w:iCs/>
+        </w:rPr>
+        <w:t xml:space="preserve">2(x/(x+2))</w:t>
+      </w:r>
+      <w:r>
+        <w:rPr>
+          <w:b/>
+          <w:bCs/>
+          <w:i/>
+          <w:iCs/>
+          <w:vertAlign w:val="superscript"/>
+        </w:rPr>
+        <w:t xml:space="preserve">2</w:t>
+      </w:r>
+      <w:r>
+        <w:rPr>
+          <w:b/>
+          <w:bCs/>
+          <w:i/>
+          <w:iCs/>
+        </w:rPr>
+        <w:t xml:space="preserve">−1</w:t>
       </w:r>
       <w:r>
         <w:rPr>
@@ -3620,7 +3274,7 @@
           <wp:inline distT="0" distB="0" distL="0" distR="0">
             <wp:extent cx="4762500" cy="1323975"/>
             <wp:effectExtent t="0" r="0" b="0" l="0"/>
-            <wp:docPr id="1" name="ev1" descr="Two machines in a row, with the output of the first feeding the second. Plotted data: A diagram of two machines in a row. The input 2 goes into machine g first. Its output, g(2), goes into machine f second. The final output, f(g(2)), is marked with a question mark." title="Two machines in a row, with the output of the first feeding the second"/>
+            <wp:docPr id="1" name="ev1" descr="Two machines in a row, with the output of the first feeding the second. Diagram: A diagram of two machines in a row. The input 2 goes into machine g first. Its output, g(2), goes into machine f second. The final output, f(g(2)), is marked with a question mark." title="Two machines in a row, with the output of the first feeding the second"/>
             <wp:cNvGraphicFramePr>
               <a:graphicFrameLocks xmlns:a="http://schemas.openxmlformats.org/drawingml/2006/main" noChangeAspect="1"/>
             </wp:cNvGraphicFramePr>
@@ -3667,7 +3321,7 @@
           <w:sz w:val="22"/>
           <w:szCs w:val="22"/>
         </w:rPr>
-        <w:t xml:space="preserve">Plotted data: </w:t>
+        <w:t xml:space="preserve">Diagram: </w:t>
       </w:r>
       <w:r>
         <w:rPr>
@@ -4235,7 +3889,26 @@
           <w:sz w:val="40"/>
           <w:szCs w:val="40"/>
         </w:rPr>
-        <w:t xml:space="preserve">r(x)=3x/(x+2)</w:t>
+        <w:t xml:space="preserve">p(x)=x</w:t>
+      </w:r>
+      <w:r>
+        <w:rPr>
+          <w:i/>
+          <w:iCs/>
+          <w:sz w:val="40"/>
+          <w:szCs w:val="40"/>
+          <w:vertAlign w:val="superscript"/>
+        </w:rPr>
+        <w:t xml:space="preserve">3</w:t>
+      </w:r>
+      <w:r>
+        <w:rPr>
+          <w:i/>
+          <w:iCs/>
+          <w:sz w:val="40"/>
+          <w:szCs w:val="40"/>
+        </w:rPr>
+        <w:t xml:space="preserve">+1</w:t>
       </w:r>
     </w:p>
     <w:p>
@@ -4250,7 +3923,7 @@
           <w:sz w:val="40"/>
           <w:szCs w:val="40"/>
         </w:rPr>
-        <w:t xml:space="preserve">s(x)=2x−5</w:t>
+        <w:t xml:space="preserve">r(x)=3x/(x+2)</w:t>
       </w:r>
     </w:p>
     <w:p>
@@ -4267,7 +3940,7 @@
         <w:spacing w:after="120" w:before="80" w:line="300"/>
       </w:pPr>
       <w:r>
-        <w:t xml:space="preserve">Find r(s(4)).</w:t>
+        <w:t xml:space="preserve">Find r(p(−2)).</w:t>
       </w:r>
     </w:p>
     <w:p>
@@ -4287,7 +3960,7 @@
           <w:i/>
           <w:iCs/>
         </w:rPr>
-        <w:t xml:space="preserve">−1</w:t>
+        <w:t xml:space="preserve">−7</w:t>
       </w:r>
     </w:p>
     <w:p>
@@ -4307,7 +3980,7 @@
           <w:i/>
           <w:iCs/>
         </w:rPr>
-        <w:t xml:space="preserve">2</w:t>
+        <w:t xml:space="preserve">−21/5</w:t>
       </w:r>
     </w:p>
     <w:p>
@@ -4327,7 +4000,7 @@
           <w:i/>
           <w:iCs/>
         </w:rPr>
-        <w:t xml:space="preserve">3/2</w:t>
+        <w:t xml:space="preserve">27/11</w:t>
       </w:r>
     </w:p>
     <w:p>
@@ -4347,7 +4020,7 @@
           <w:i/>
           <w:iCs/>
         </w:rPr>
-        <w:t xml:space="preserve">9/5</w:t>
+        <w:t xml:space="preserve">21/5</w:t>
       </w:r>
     </w:p>
     <w:p>
@@ -4364,17 +4037,42 @@
         <w:spacing w:after="120" w:before="80" w:line="300"/>
       </w:pPr>
       <w:r>
-        <w:t xml:space="preserve">Inside first: </w:t>
-      </w:r>
-      <w:r>
-        <w:rPr>
-          <w:i/>
-          <w:iCs/>
-        </w:rPr>
-        <w:t xml:space="preserve">s(4)=2(4)−5=3</w:t>
-      </w:r>
-      <w:r>
-        <w:t xml:space="preserve">. Then 3 replaces both </w:t>
+        <w:t xml:space="preserve">Inside first, and the input is negative: </w:t>
+      </w:r>
+      <w:r>
+        <w:rPr>
+          <w:i/>
+          <w:iCs/>
+        </w:rPr>
+        <w:t xml:space="preserve">p(−2)=(−2)</w:t>
+      </w:r>
+      <w:r>
+        <w:rPr>
+          <w:i/>
+          <w:iCs/>
+          <w:vertAlign w:val="superscript"/>
+        </w:rPr>
+        <w:t xml:space="preserve">3</w:t>
+      </w:r>
+      <w:r>
+        <w:rPr>
+          <w:i/>
+          <w:iCs/>
+        </w:rPr>
+        <w:t xml:space="preserve">+1=−8+1=−7</w:t>
+      </w:r>
+      <w:r>
+        <w:t xml:space="preserve">. Then </w:t>
+      </w:r>
+      <w:r>
+        <w:rPr>
+          <w:i/>
+          <w:iCs/>
+        </w:rPr>
+        <w:t xml:space="preserve">−7</w:t>
+      </w:r>
+      <w:r>
+        <w:t xml:space="preserve"> replaces both </w:t>
       </w:r>
       <w:r>
         <w:rPr>
@@ -4401,7 +4099,7 @@
           <w:i/>
           <w:iCs/>
         </w:rPr>
-        <w:t xml:space="preserve">r(3)=(3(3))/(3+2)=9/5</w:t>
+        <w:t xml:space="preserve">r(−7)=(3(−7))/(−7+2)=(−21)/(−5)=21/5</w:t>
       </w:r>
       <w:r>
         <w:t xml:space="preserve">. </w:t>
@@ -4411,59 +4109,94 @@
           <w:i/>
           <w:iCs/>
         </w:rPr>
-        <w:t xml:space="preserve">−1</w:t>
-      </w:r>
-      <w:r>
-        <w:t xml:space="preserve"> is </w:t>
-      </w:r>
-      <w:r>
-        <w:rPr>
-          <w:i/>
-          <w:iCs/>
-        </w:rPr>
-        <w:t xml:space="preserve">s(r(4))=s(2)</w:t>
-      </w:r>
-      <w:r>
-        <w:t xml:space="preserve">, the other order; 2 is </w:t>
-      </w:r>
-      <w:r>
-        <w:rPr>
-          <w:i/>
-          <w:iCs/>
-        </w:rPr>
-        <w:t xml:space="preserve">r(4)=12/6</w:t>
-      </w:r>
-      <w:r>
-        <w:t xml:space="preserve">, which skips </w:t>
-      </w:r>
-      <w:r>
-        <w:rPr>
-          <w:i/>
-          <w:iCs/>
-        </w:rPr>
-        <w:t xml:space="preserve">s</w:t>
-      </w:r>
-      <w:r>
-        <w:t xml:space="preserve">; and </w:t>
-      </w:r>
-      <w:r>
-        <w:rPr>
-          <w:i/>
-          <w:iCs/>
-        </w:rPr>
-        <w:t xml:space="preserve">3/2=9/6</w:t>
-      </w:r>
-      <w:r>
-        <w:t xml:space="preserve"> puts the 3 on top but leaves the original 4 on the bottom. </w:t>
-      </w:r>
-      <w:r>
-        <w:rPr>
-          <w:b/>
-          <w:bCs/>
-          <w:i/>
-          <w:iCs/>
-        </w:rPr>
-        <w:t xml:space="preserve">r(s(4))=9/5</w:t>
+        <w:t xml:space="preserve">−7</w:t>
+      </w:r>
+      <w:r>
+        <w:t xml:space="preserve"> stops at </w:t>
+      </w:r>
+      <w:r>
+        <w:rPr>
+          <w:i/>
+          <w:iCs/>
+        </w:rPr>
+        <w:t xml:space="preserve">p(−2)</w:t>
+      </w:r>
+      <w:r>
+        <w:t xml:space="preserve">; </w:t>
+      </w:r>
+      <w:r>
+        <w:rPr>
+          <w:i/>
+          <w:iCs/>
+        </w:rPr>
+        <w:t xml:space="preserve">−21/5</w:t>
+      </w:r>
+      <w:r>
+        <w:t xml:space="preserve"> works out </w:t>
+      </w:r>
+      <w:r>
+        <w:rPr>
+          <w:i/>
+          <w:iCs/>
+        </w:rPr>
+        <w:t xml:space="preserve">−7+2</w:t>
+      </w:r>
+      <w:r>
+        <w:t xml:space="preserve"> as 5; and </w:t>
+      </w:r>
+      <w:r>
+        <w:rPr>
+          <w:i/>
+          <w:iCs/>
+        </w:rPr>
+        <w:t xml:space="preserve">27/11</w:t>
+      </w:r>
+      <w:r>
+        <w:t xml:space="preserve"> uses </w:t>
+      </w:r>
+      <w:r>
+        <w:rPr>
+          <w:i/>
+          <w:iCs/>
+        </w:rPr>
+        <w:t xml:space="preserve">(−2)</w:t>
+      </w:r>
+      <w:r>
+        <w:rPr>
+          <w:i/>
+          <w:iCs/>
+          <w:vertAlign w:val="superscript"/>
+        </w:rPr>
+        <w:t xml:space="preserve">3</w:t>
+      </w:r>
+      <w:r>
+        <w:rPr>
+          <w:i/>
+          <w:iCs/>
+        </w:rPr>
+        <w:t xml:space="preserve">=8</w:t>
+      </w:r>
+      <w:r>
+        <w:t xml:space="preserve">, so </w:t>
+      </w:r>
+      <w:r>
+        <w:rPr>
+          <w:i/>
+          <w:iCs/>
+        </w:rPr>
+        <w:t xml:space="preserve">p(−2)</w:t>
+      </w:r>
+      <w:r>
+        <w:t xml:space="preserve"> comes out 9. </w:t>
+      </w:r>
+      <w:r>
+        <w:rPr>
+          <w:b/>
+          <w:bCs/>
+          <w:i/>
+          <w:iCs/>
+        </w:rPr>
+        <w:t xml:space="preserve">r(p(−2))=21/5</w:t>
       </w:r>
       <w:r>
         <w:rPr>
@@ -4528,7 +4261,7 @@
           <w:sz w:val="40"/>
           <w:szCs w:val="40"/>
         </w:rPr>
-        <w:t xml:space="preserve">k(x)=3x−1</w:t>
+        <w:t xml:space="preserve">q(x)=3x−1</w:t>
       </w:r>
     </w:p>
     <w:p>
@@ -4543,7 +4276,7 @@
           <w:sz w:val="40"/>
           <w:szCs w:val="40"/>
         </w:rPr>
-        <w:t xml:space="preserve">h(k(x))=9x</w:t>
+        <w:t xml:space="preserve">h(q(x))=9x</w:t>
       </w:r>
       <w:r>
         <w:rPr>
@@ -4579,7 +4312,7 @@
         <w:spacing w:after="120" w:before="80" w:line="300"/>
       </w:pPr>
       <w:r>
-        <w:t xml:space="preserve">Like CheckIt, the formula for h(k(x)) is given first. Now find k(h(−1)).</w:t>
+        <w:t xml:space="preserve">Like CheckIt, the formula for h(q(x)) is given first. Now find q(h(−1)).</w:t>
       </w:r>
     </w:p>
     <w:p>
@@ -4683,7 +4416,7 @@
           <w:i/>
           <w:iCs/>
         </w:rPr>
-        <w:t xml:space="preserve">k(h(−1))</w:t>
+        <w:t xml:space="preserve">q(h(−1))</w:t>
       </w:r>
       <w:r>
         <w:t xml:space="preserve">, the opposite order from the formula, so that formula does not help. Inside first: </w:t>
@@ -4718,7 +4451,7 @@
           <w:i/>
           <w:iCs/>
         </w:rPr>
-        <w:t xml:space="preserve">k(3)=3(3)−1=8</w:t>
+        <w:t xml:space="preserve">q(3)=3(3)−1=8</w:t>
       </w:r>
       <w:r>
         <w:t xml:space="preserve">. 18 puts </w:t>
@@ -4738,7 +4471,7 @@
           <w:i/>
           <w:iCs/>
         </w:rPr>
-        <w:t xml:space="preserve">h(k(x))</w:t>
+        <w:t xml:space="preserve">h(q(x))</w:t>
       </w:r>
       <w:r>
         <w:t xml:space="preserve"> formula, the wrong order; 3 stops at </w:t>
@@ -4788,7 +4521,7 @@
           <w:i/>
           <w:iCs/>
         </w:rPr>
-        <w:t xml:space="preserve">k(1)=2</w:t>
+        <w:t xml:space="preserve">q(1)=2</w:t>
       </w:r>
       <w:r>
         <w:t xml:space="preserve">. </w:t>
@@ -4800,7 +4533,7 @@
           <w:i/>
           <w:iCs/>
         </w:rPr>
-        <w:t xml:space="preserve">k(h(−1))=8</w:t>
+        <w:t xml:space="preserve">q(h(−1))=8</w:t>
       </w:r>
       <w:r>
         <w:rPr>
@@ -6081,7 +5814,7 @@
           <w:sz w:val="40"/>
           <w:szCs w:val="40"/>
         </w:rPr>
-        <w:t xml:space="preserve">(f(x))/(g(x))=(2x</w:t>
+        <w:t xml:space="preserve">f(x)/g(x)=(2x</w:t>
       </w:r>
       <w:r>
         <w:rPr>
@@ -6100,7 +5833,7 @@
           <w:sz w:val="40"/>
           <w:szCs w:val="40"/>
         </w:rPr>
-        <w:t xml:space="preserve">+3)/2x=x+3</w:t>
+        <w:t xml:space="preserve">+3)/(2x)=x+3</w:t>
       </w:r>
     </w:p>
     <w:p>
@@ -6181,7 +5914,7 @@
         <w:t xml:space="preserve">D.  </w:t>
       </w:r>
       <w:r>
-        <w:t xml:space="preserve">It should be x + 3/2, dividing just the 3 by the 2.</w:t>
+        <w:t xml:space="preserve">It should be x + 1.5, dividing just the 3 by the 2.</w:t>
       </w:r>
     </w:p>
     <w:p>
@@ -6248,7 +5981,7 @@
           <w:i/>
           <w:iCs/>
         </w:rPr>
-        <w:t xml:space="preserve">)/2x+3/2x=x+3/2x</w:t>
+        <w:t xml:space="preserve">)/(2x)+3/(2x)=x+3/(2x)</w:t>
       </w:r>
       <w:r>
         <w:t xml:space="preserve">, or leave it as </w:t>
@@ -6273,7 +6006,7 @@
           <w:i/>
           <w:iCs/>
         </w:rPr>
-        <w:t xml:space="preserve">+3)/2x</w:t>
+        <w:t xml:space="preserve">+3)/(2x)</w:t>
       </w:r>
       <w:r>
         <w:t xml:space="preserve">, the way CheckIt does. The order </w:t>
@@ -6303,10 +6036,20 @@
           <w:i/>
           <w:iCs/>
         </w:rPr>
+        <w:t xml:space="preserve">x+1.5</w:t>
+      </w:r>
+      <w:r>
+        <w:t xml:space="preserve">, which is </w:t>
+      </w:r>
+      <w:r>
+        <w:rPr>
+          <w:i/>
+          <w:iCs/>
+        </w:rPr>
         <w:t xml:space="preserve">x+3/2</w:t>
       </w:r>
       <w:r>
-        <w:t xml:space="preserve"> forgets that the 3 is divided by </w:t>
+        <w:t xml:space="preserve">, forgets that the 3 is divided by </w:t>
       </w:r>
       <w:r>
         <w:rPr>
@@ -6344,7 +6087,7 @@
           <w:i/>
           <w:iCs/>
         </w:rPr>
-        <w:t xml:space="preserve">+3)/2x=x+3/2x</w:t>
+        <w:t xml:space="preserve">+3)/(2x)=x+3/(2x)</w:t>
       </w:r>
       <w:r>
         <w:rPr>

</xml_diff>